<commit_message>
Deploying to gh-pages from @ Morrison-Lab/ids@73cebc995d714cbf6596e1d6e30bc91f4710ff9a 🚀
</commit_message>
<xml_diff>
--- a/error-correcting-codes.docx
+++ b/error-correcting-codes.docx
@@ -15,7 +15,7 @@
         <w:pStyle w:val="Date"/>
       </w:pPr>
       <w:r>
-        <w:t xml:space="preserve">Last modified: 2026-10-14 11:45:26 (PDT)</w:t>
+        <w:t xml:space="preserve">Last modified: 2026-10-14 23:34:53 (PDT)</w:t>
       </w:r>
     </w:p>
     <w:p>
@@ -56,7 +56,7 @@
         <w:t xml:space="preserve">lead to central results of computational complexity.</w:t>
       </w:r>
     </w:p>
-    <w:bookmarkStart w:id="15" w:name="sec-codes-and-distance"/>
+    <w:bookmarkStart w:id="17" w:name="sec-codes-and-distance"/>
     <w:p>
       <w:pPr>
         <w:pStyle w:val="Heading2"/>
@@ -107,6 +107,15 @@
         <m:r>
           <m:t>q</m:t>
         </m:r>
+        <m:r>
+          <m:rPr>
+            <m:sty m:val="p"/>
+          </m:rPr>
+          <m:t>≥</m:t>
+        </m:r>
+        <m:r>
+          <m:t>2</m:t>
+        </m:r>
       </m:oMath>
       <w:r>
         <w:t xml:space="preserve"> </w:t>
@@ -266,64 +275,68 @@
           <m:t>=</m:t>
         </m:r>
         <m:r>
-          <m:rPr>
-            <m:sty m:val="p"/>
-          </m:rPr>
-          <m:t>{</m:t>
-        </m:r>
-        <m:r>
-          <m:t>E</m:t>
-        </m:r>
-        <m:r>
-          <m:rPr>
-            <m:sty m:val="p"/>
-          </m:rPr>
-          <m:t>(</m:t>
-        </m:r>
-        <m:r>
-          <m:t>m</m:t>
-        </m:r>
-        <m:r>
-          <m:rPr>
-            <m:sty m:val="p"/>
-          </m:rPr>
-          <m:t>)</m:t>
-        </m:r>
-        <m:r>
-          <m:rPr>
-            <m:sty m:val="p"/>
-          </m:rPr>
-          <m:t>:</m:t>
-        </m:r>
-        <m:r>
-          <m:t>m</m:t>
-        </m:r>
-        <m:r>
-          <m:rPr>
-            <m:sty m:val="p"/>
-          </m:rPr>
-          <m:t>∈</m:t>
-        </m:r>
-        <m:sSup>
+          <m:t>​</m:t>
+        </m:r>
+        <m:d>
+          <m:dPr>
+            <m:begChr m:val="{"/>
+            <m:sepChr m:val=""/>
+            <m:endChr m:val="}"/>
+            <m:grow/>
+          </m:dPr>
           <m:e>
+            <m:r>
+              <m:t>E</m:t>
+            </m:r>
             <m:r>
               <m:rPr>
                 <m:sty m:val="p"/>
               </m:rPr>
-              <m:t>Σ</m:t>
-            </m:r>
+              <m:t>(</m:t>
+            </m:r>
+            <m:r>
+              <m:t>m</m:t>
+            </m:r>
+            <m:r>
+              <m:rPr>
+                <m:sty m:val="p"/>
+              </m:rPr>
+              <m:t>)</m:t>
+            </m:r>
+            <m:r>
+              <m:rPr>
+                <m:sty m:val="p"/>
+              </m:rPr>
+              <m:t>:</m:t>
+            </m:r>
+            <m:r>
+              <m:t>m</m:t>
+            </m:r>
+            <m:r>
+              <m:rPr>
+                <m:sty m:val="p"/>
+              </m:rPr>
+              <m:t>∈</m:t>
+            </m:r>
+            <m:sSup>
+              <m:e>
+                <m:r>
+                  <m:rPr>
+                    <m:sty m:val="p"/>
+                  </m:rPr>
+                  <m:t>Σ</m:t>
+                </m:r>
+              </m:e>
+              <m:sup>
+                <m:r>
+                  <m:t>k</m:t>
+                </m:r>
+              </m:sup>
+            </m:sSup>
           </m:e>
-          <m:sup>
-            <m:r>
-              <m:t>k</m:t>
-            </m:r>
-          </m:sup>
-        </m:sSup>
-        <m:r>
-          <m:rPr>
-            <m:sty m:val="p"/>
-          </m:rPr>
-          <m:t>}</m:t>
+        </m:d>
+        <m:r>
+          <m:t>​</m:t>
         </m:r>
       </m:oMath>
       <w:r>
@@ -456,28 +469,32 @@
           <m:t>Δ</m:t>
         </m:r>
         <m:r>
-          <m:rPr>
-            <m:sty m:val="p"/>
-          </m:rPr>
-          <m:t>(</m:t>
-        </m:r>
-        <m:r>
-          <m:t>x</m:t>
-        </m:r>
-        <m:r>
-          <m:rPr>
-            <m:sty m:val="p"/>
-          </m:rPr>
-          <m:t>,</m:t>
-        </m:r>
-        <m:r>
-          <m:t>y</m:t>
-        </m:r>
-        <m:r>
-          <m:rPr>
-            <m:sty m:val="p"/>
-          </m:rPr>
-          <m:t>)</m:t>
+          <m:t>​</m:t>
+        </m:r>
+        <m:d>
+          <m:dPr>
+            <m:begChr m:val="("/>
+            <m:sepChr m:val=""/>
+            <m:endChr m:val=")"/>
+            <m:grow/>
+          </m:dPr>
+          <m:e>
+            <m:r>
+              <m:t>x</m:t>
+            </m:r>
+            <m:r>
+              <m:rPr>
+                <m:sty m:val="p"/>
+              </m:rPr>
+              <m:t>,</m:t>
+            </m:r>
+            <m:r>
+              <m:t>y</m:t>
+            </m:r>
+          </m:e>
+        </m:d>
+        <m:r>
+          <m:t>​</m:t>
         </m:r>
       </m:oMath>
       <w:r>
@@ -674,130 +691,138 @@
             <m:t>min</m:t>
           </m:r>
           <m:r>
-            <m:rPr>
-              <m:sty m:val="p"/>
-            </m:rPr>
-            <m:t>{</m:t>
+            <m:t>​</m:t>
           </m:r>
-          <m:r>
-            <m:rPr>
-              <m:sty m:val="p"/>
-            </m:rPr>
-            <m:t>Δ</m:t>
-          </m:r>
-          <m:r>
-            <m:rPr>
-              <m:sty m:val="p"/>
-            </m:rPr>
-            <m:t>(</m:t>
-          </m:r>
-          <m:r>
-            <m:t>c</m:t>
-          </m:r>
-          <m:r>
-            <m:rPr>
-              <m:sty m:val="p"/>
-            </m:rPr>
-            <m:t>,</m:t>
-          </m:r>
-          <m:sSup>
+          <m:d>
+            <m:dPr>
+              <m:begChr m:val="{"/>
+              <m:sepChr m:val=""/>
+              <m:endChr m:val="}"/>
+              <m:grow/>
+            </m:dPr>
             <m:e>
-              <m:r>
-                <m:t>c</m:t>
-              </m:r>
-            </m:e>
-            <m:sup>
               <m:r>
                 <m:rPr>
                   <m:sty m:val="p"/>
                 </m:rPr>
-                <m:t>′</m:t>
+                <m:t>Δ</m:t>
               </m:r>
-            </m:sup>
-          </m:sSup>
-          <m:r>
-            <m:rPr>
-              <m:sty m:val="p"/>
-            </m:rPr>
-            <m:t>)</m:t>
-          </m:r>
-          <m:r>
-            <m:rPr>
-              <m:sty m:val="p"/>
-            </m:rPr>
-            <m:t>:</m:t>
-          </m:r>
-          <m:r>
-            <m:t>c</m:t>
-          </m:r>
-          <m:r>
-            <m:rPr>
-              <m:sty m:val="p"/>
-            </m:rPr>
-            <m:t>,</m:t>
-          </m:r>
-          <m:sSup>
-            <m:e>
               <m:r>
-                <m:t>c</m:t>
+                <m:t>​</m:t>
               </m:r>
-            </m:e>
-            <m:sup>
+              <m:d>
+                <m:dPr>
+                  <m:begChr m:val="("/>
+                  <m:sepChr m:val=""/>
+                  <m:endChr m:val=")"/>
+                  <m:grow/>
+                </m:dPr>
+                <m:e>
+                  <m:r>
+                    <m:t>c</m:t>
+                  </m:r>
+                  <m:r>
+                    <m:rPr>
+                      <m:sty m:val="p"/>
+                    </m:rPr>
+                    <m:t>,</m:t>
+                  </m:r>
+                  <m:sSup>
+                    <m:e>
+                      <m:r>
+                        <m:t>c</m:t>
+                      </m:r>
+                    </m:e>
+                    <m:sup>
+                      <m:r>
+                        <m:rPr>
+                          <m:sty m:val="p"/>
+                        </m:rPr>
+                        <m:t>′</m:t>
+                      </m:r>
+                    </m:sup>
+                  </m:sSup>
+                </m:e>
+              </m:d>
+              <m:r>
+                <m:t>​</m:t>
+              </m:r>
               <m:r>
                 <m:rPr>
                   <m:sty m:val="p"/>
                 </m:rPr>
-                <m:t>′</m:t>
+                <m:t>:</m:t>
               </m:r>
-            </m:sup>
-          </m:sSup>
-          <m:r>
-            <m:rPr>
-              <m:sty m:val="p"/>
-            </m:rPr>
-            <m:t>∈</m:t>
-          </m:r>
-          <m:r>
-            <m:t>C</m:t>
-          </m:r>
-          <m:r>
-            <m:rPr>
-              <m:sty m:val="p"/>
-            </m:rPr>
-            <m:t>,</m:t>
-          </m:r>
-          <m:r>
-            <m:t> </m:t>
-          </m:r>
-          <m:r>
-            <m:t>c</m:t>
-          </m:r>
-          <m:r>
-            <m:rPr>
-              <m:sty m:val="p"/>
-            </m:rPr>
-            <m:t>≠</m:t>
-          </m:r>
-          <m:sSup>
-            <m:e>
               <m:r>
                 <m:t>c</m:t>
               </m:r>
-            </m:e>
-            <m:sup>
               <m:r>
                 <m:rPr>
                   <m:sty m:val="p"/>
                 </m:rPr>
-                <m:t>′</m:t>
+                <m:t>,</m:t>
               </m:r>
-            </m:sup>
-          </m:sSup>
+              <m:sSup>
+                <m:e>
+                  <m:r>
+                    <m:t>c</m:t>
+                  </m:r>
+                </m:e>
+                <m:sup>
+                  <m:r>
+                    <m:rPr>
+                      <m:sty m:val="p"/>
+                    </m:rPr>
+                    <m:t>′</m:t>
+                  </m:r>
+                </m:sup>
+              </m:sSup>
+              <m:r>
+                <m:rPr>
+                  <m:sty m:val="p"/>
+                </m:rPr>
+                <m:t>∈</m:t>
+              </m:r>
+              <m:r>
+                <m:t>C</m:t>
+              </m:r>
+              <m:r>
+                <m:rPr>
+                  <m:sty m:val="p"/>
+                </m:rPr>
+                <m:t>,</m:t>
+              </m:r>
+              <m:r>
+                <m:t> </m:t>
+              </m:r>
+              <m:r>
+                <m:t>c</m:t>
+              </m:r>
+              <m:r>
+                <m:rPr>
+                  <m:sty m:val="p"/>
+                </m:rPr>
+                <m:t>≠</m:t>
+              </m:r>
+              <m:sSup>
+                <m:e>
+                  <m:r>
+                    <m:t>c</m:t>
+                  </m:r>
+                </m:e>
+                <m:sup>
+                  <m:r>
+                    <m:rPr>
+                      <m:sty m:val="p"/>
+                    </m:rPr>
+                    <m:t>′</m:t>
+                  </m:r>
+                </m:sup>
+              </m:sSup>
+            </m:e>
+          </m:d>
           <m:r>
-            <m:rPr>
-              <m:sty m:val="p"/>
-            </m:rPr>
-            <m:t>}</m:t>
+            <m:t>​</m:t>
           </m:r>
           <m:r>
             <m:rPr>
@@ -992,49 +1017,53 @@
           </m:lim>
         </m:limUpp>
         <m:r>
-          <m:rPr>
-            <m:sty m:val="p"/>
-          </m:rPr>
-          <m:t>⌊</m:t>
-        </m:r>
-        <m:r>
-          <m:rPr>
-            <m:sty m:val="p"/>
-          </m:rPr>
-          <m:t>(</m:t>
-        </m:r>
-        <m:r>
-          <m:t>d</m:t>
-        </m:r>
-        <m:r>
-          <m:rPr>
-            <m:sty m:val="p"/>
-          </m:rPr>
-          <m:t>−</m:t>
-        </m:r>
-        <m:r>
-          <m:t>1</m:t>
-        </m:r>
-        <m:r>
-          <m:rPr>
-            <m:sty m:val="p"/>
-          </m:rPr>
-          <m:t>)</m:t>
-        </m:r>
-        <m:r>
-          <m:rPr>
-            <m:sty m:val="p"/>
-          </m:rPr>
-          <m:t>/</m:t>
-        </m:r>
-        <m:r>
-          <m:t>2</m:t>
-        </m:r>
-        <m:r>
-          <m:rPr>
-            <m:sty m:val="p"/>
-          </m:rPr>
-          <m:t>⌋</m:t>
+          <m:t>​</m:t>
+        </m:r>
+        <m:d>
+          <m:dPr>
+            <m:begChr m:val="⌊"/>
+            <m:sepChr m:val=""/>
+            <m:endChr m:val="⌋"/>
+            <m:grow/>
+          </m:dPr>
+          <m:e>
+            <m:r>
+              <m:rPr>
+                <m:sty m:val="p"/>
+              </m:rPr>
+              <m:t>(</m:t>
+            </m:r>
+            <m:r>
+              <m:t>d</m:t>
+            </m:r>
+            <m:r>
+              <m:rPr>
+                <m:sty m:val="p"/>
+              </m:rPr>
+              <m:t>−</m:t>
+            </m:r>
+            <m:r>
+              <m:t>1</m:t>
+            </m:r>
+            <m:r>
+              <m:rPr>
+                <m:sty m:val="p"/>
+              </m:rPr>
+              <m:t>)</m:t>
+            </m:r>
+            <m:r>
+              <m:rPr>
+                <m:sty m:val="p"/>
+              </m:rPr>
+              <m:t>/</m:t>
+            </m:r>
+            <m:r>
+              <m:t>2</m:t>
+            </m:r>
+          </m:e>
+        </m:d>
+        <m:r>
+          <m:t>​</m:t>
         </m:r>
       </m:oMath>
       <w:r>
@@ -1136,28 +1165,32 @@
           <m:t>Δ</m:t>
         </m:r>
         <m:r>
-          <m:rPr>
-            <m:sty m:val="p"/>
-          </m:rPr>
-          <m:t>(</m:t>
-        </m:r>
-        <m:r>
-          <m:t>c</m:t>
-        </m:r>
-        <m:r>
-          <m:rPr>
-            <m:sty m:val="p"/>
-          </m:rPr>
-          <m:t>,</m:t>
-        </m:r>
-        <m:r>
-          <m:t>y</m:t>
-        </m:r>
-        <m:r>
-          <m:rPr>
-            <m:sty m:val="p"/>
-          </m:rPr>
-          <m:t>)</m:t>
+          <m:t>​</m:t>
+        </m:r>
+        <m:d>
+          <m:dPr>
+            <m:begChr m:val="("/>
+            <m:sepChr m:val=""/>
+            <m:endChr m:val=")"/>
+            <m:grow/>
+          </m:dPr>
+          <m:e>
+            <m:r>
+              <m:t>c</m:t>
+            </m:r>
+            <m:r>
+              <m:rPr>
+                <m:sty m:val="p"/>
+              </m:rPr>
+              <m:t>,</m:t>
+            </m:r>
+            <m:r>
+              <m:t>y</m:t>
+            </m:r>
+          </m:e>
+        </m:d>
+        <m:r>
+          <m:t>​</m:t>
         </m:r>
         <m:r>
           <m:rPr>
@@ -1270,40 +1303,44 @@
           <m:t>Δ</m:t>
         </m:r>
         <m:r>
-          <m:rPr>
-            <m:sty m:val="p"/>
-          </m:rPr>
-          <m:t>(</m:t>
-        </m:r>
-        <m:r>
-          <m:t>c</m:t>
-        </m:r>
-        <m:r>
-          <m:rPr>
-            <m:sty m:val="p"/>
-          </m:rPr>
-          <m:t>,</m:t>
-        </m:r>
-        <m:sSup>
+          <m:t>​</m:t>
+        </m:r>
+        <m:d>
+          <m:dPr>
+            <m:begChr m:val="("/>
+            <m:sepChr m:val=""/>
+            <m:endChr m:val=")"/>
+            <m:grow/>
+          </m:dPr>
           <m:e>
             <m:r>
               <m:t>c</m:t>
             </m:r>
-          </m:e>
-          <m:sup>
             <m:r>
               <m:rPr>
                 <m:sty m:val="p"/>
               </m:rPr>
-              <m:t>′</m:t>
-            </m:r>
-          </m:sup>
-        </m:sSup>
-        <m:r>
-          <m:rPr>
-            <m:sty m:val="p"/>
-          </m:rPr>
-          <m:t>)</m:t>
+              <m:t>,</m:t>
+            </m:r>
+            <m:sSup>
+              <m:e>
+                <m:r>
+                  <m:t>c</m:t>
+                </m:r>
+              </m:e>
+              <m:sup>
+                <m:r>
+                  <m:rPr>
+                    <m:sty m:val="p"/>
+                  </m:rPr>
+                  <m:t>′</m:t>
+                </m:r>
+              </m:sup>
+            </m:sSup>
+          </m:e>
+        </m:d>
+        <m:r>
+          <m:t>​</m:t>
         </m:r>
         <m:r>
           <m:rPr>
@@ -1318,28 +1355,32 @@
           <m:t>Δ</m:t>
         </m:r>
         <m:r>
-          <m:rPr>
-            <m:sty m:val="p"/>
-          </m:rPr>
-          <m:t>(</m:t>
-        </m:r>
-        <m:r>
-          <m:t>c</m:t>
-        </m:r>
-        <m:r>
-          <m:rPr>
-            <m:sty m:val="p"/>
-          </m:rPr>
-          <m:t>,</m:t>
-        </m:r>
-        <m:r>
-          <m:t>y</m:t>
-        </m:r>
-        <m:r>
-          <m:rPr>
-            <m:sty m:val="p"/>
-          </m:rPr>
-          <m:t>)</m:t>
+          <m:t>​</m:t>
+        </m:r>
+        <m:d>
+          <m:dPr>
+            <m:begChr m:val="("/>
+            <m:sepChr m:val=""/>
+            <m:endChr m:val=")"/>
+            <m:grow/>
+          </m:dPr>
+          <m:e>
+            <m:r>
+              <m:t>c</m:t>
+            </m:r>
+            <m:r>
+              <m:rPr>
+                <m:sty m:val="p"/>
+              </m:rPr>
+              <m:t>,</m:t>
+            </m:r>
+            <m:r>
+              <m:t>y</m:t>
+            </m:r>
+          </m:e>
+        </m:d>
+        <m:r>
+          <m:t>​</m:t>
         </m:r>
         <m:r>
           <m:rPr>
@@ -1526,40 +1567,44 @@
             <m:t>Δ</m:t>
           </m:r>
           <m:r>
-            <m:rPr>
-              <m:sty m:val="p"/>
-            </m:rPr>
-            <m:t>(</m:t>
+            <m:t>​</m:t>
           </m:r>
-          <m:sSup>
+          <m:d>
+            <m:dPr>
+              <m:begChr m:val="("/>
+              <m:sepChr m:val=""/>
+              <m:endChr m:val=")"/>
+              <m:grow/>
+            </m:dPr>
             <m:e>
-              <m:r>
-                <m:t>c</m:t>
-              </m:r>
-            </m:e>
-            <m:sup>
+              <m:sSup>
+                <m:e>
+                  <m:r>
+                    <m:t>c</m:t>
+                  </m:r>
+                </m:e>
+                <m:sup>
+                  <m:r>
+                    <m:rPr>
+                      <m:sty m:val="p"/>
+                    </m:rPr>
+                    <m:t>′</m:t>
+                  </m:r>
+                </m:sup>
+              </m:sSup>
               <m:r>
                 <m:rPr>
                   <m:sty m:val="p"/>
                 </m:rPr>
-                <m:t>′</m:t>
+                <m:t>,</m:t>
               </m:r>
-            </m:sup>
-          </m:sSup>
+              <m:r>
+                <m:t>y</m:t>
+              </m:r>
+            </m:e>
+          </m:d>
           <m:r>
-            <m:rPr>
-              <m:sty m:val="p"/>
-            </m:rPr>
-            <m:t>,</m:t>
-          </m:r>
-          <m:r>
-            <m:t>y</m:t>
-          </m:r>
-          <m:r>
-            <m:rPr>
-              <m:sty m:val="p"/>
-            </m:rPr>
-            <m:t>)</m:t>
+            <m:t>​</m:t>
           </m:r>
           <m:r>
             <m:rPr>
@@ -1574,40 +1619,44 @@
             <m:t>Δ</m:t>
           </m:r>
           <m:r>
-            <m:rPr>
-              <m:sty m:val="p"/>
-            </m:rPr>
-            <m:t>(</m:t>
+            <m:t>​</m:t>
           </m:r>
-          <m:r>
-            <m:t>c</m:t>
-          </m:r>
-          <m:r>
-            <m:rPr>
-              <m:sty m:val="p"/>
-            </m:rPr>
-            <m:t>,</m:t>
-          </m:r>
-          <m:sSup>
+          <m:d>
+            <m:dPr>
+              <m:begChr m:val="("/>
+              <m:sepChr m:val=""/>
+              <m:endChr m:val=")"/>
+              <m:grow/>
+            </m:dPr>
             <m:e>
               <m:r>
                 <m:t>c</m:t>
               </m:r>
-            </m:e>
-            <m:sup>
               <m:r>
                 <m:rPr>
                   <m:sty m:val="p"/>
                 </m:rPr>
-                <m:t>′</m:t>
+                <m:t>,</m:t>
               </m:r>
-            </m:sup>
-          </m:sSup>
+              <m:sSup>
+                <m:e>
+                  <m:r>
+                    <m:t>c</m:t>
+                  </m:r>
+                </m:e>
+                <m:sup>
+                  <m:r>
+                    <m:rPr>
+                      <m:sty m:val="p"/>
+                    </m:rPr>
+                    <m:t>′</m:t>
+                  </m:r>
+                </m:sup>
+              </m:sSup>
+            </m:e>
+          </m:d>
           <m:r>
-            <m:rPr>
-              <m:sty m:val="p"/>
-            </m:rPr>
-            <m:t>)</m:t>
+            <m:t>​</m:t>
           </m:r>
           <m:r>
             <m:rPr>
@@ -1622,28 +1671,32 @@
             <m:t>Δ</m:t>
           </m:r>
           <m:r>
-            <m:rPr>
-              <m:sty m:val="p"/>
-            </m:rPr>
-            <m:t>(</m:t>
+            <m:t>​</m:t>
           </m:r>
+          <m:d>
+            <m:dPr>
+              <m:begChr m:val="("/>
+              <m:sepChr m:val=""/>
+              <m:endChr m:val=")"/>
+              <m:grow/>
+            </m:dPr>
+            <m:e>
+              <m:r>
+                <m:t>c</m:t>
+              </m:r>
+              <m:r>
+                <m:rPr>
+                  <m:sty m:val="p"/>
+                </m:rPr>
+                <m:t>,</m:t>
+              </m:r>
+              <m:r>
+                <m:t>y</m:t>
+              </m:r>
+            </m:e>
+          </m:d>
           <m:r>
-            <m:t>c</m:t>
-          </m:r>
-          <m:r>
-            <m:rPr>
-              <m:sty m:val="p"/>
-            </m:rPr>
-            <m:t>,</m:t>
-          </m:r>
-          <m:r>
-            <m:t>y</m:t>
-          </m:r>
-          <m:r>
-            <m:rPr>
-              <m:sty m:val="p"/>
-            </m:rPr>
-            <m:t>)</m:t>
+            <m:t>​</m:t>
           </m:r>
           <m:r>
             <m:rPr>
@@ -1694,28 +1747,32 @@
             <m:t>Δ</m:t>
           </m:r>
           <m:r>
-            <m:rPr>
-              <m:sty m:val="p"/>
-            </m:rPr>
-            <m:t>(</m:t>
+            <m:t>​</m:t>
           </m:r>
+          <m:d>
+            <m:dPr>
+              <m:begChr m:val="("/>
+              <m:sepChr m:val=""/>
+              <m:endChr m:val=")"/>
+              <m:grow/>
+            </m:dPr>
+            <m:e>
+              <m:r>
+                <m:t>c</m:t>
+              </m:r>
+              <m:r>
+                <m:rPr>
+                  <m:sty m:val="p"/>
+                </m:rPr>
+                <m:t>,</m:t>
+              </m:r>
+              <m:r>
+                <m:t>y</m:t>
+              </m:r>
+            </m:e>
+          </m:d>
           <m:r>
-            <m:t>c</m:t>
-          </m:r>
-          <m:r>
-            <m:rPr>
-              <m:sty m:val="p"/>
-            </m:rPr>
-            <m:t>,</m:t>
-          </m:r>
-          <m:r>
-            <m:t>y</m:t>
-          </m:r>
-          <m:r>
-            <m:rPr>
-              <m:sty m:val="p"/>
-            </m:rPr>
-            <m:t>)</m:t>
+            <m:t>​</m:t>
           </m:r>
           <m:r>
             <m:rPr>
@@ -1807,7 +1864,7 @@
         <w:t xml:space="preserve">.</w:t>
       </w:r>
     </w:p>
-    <w:bookmarkStart w:id="12" w:name="exm-repetition-code-distance"/>
+    <w:bookmarkStart w:id="13" w:name="exm-repetition-code-distance"/>
     <w:p>
       <w:pPr>
         <w:pStyle w:val="BodyText"/>
@@ -2066,11 +2123,34 @@
         </m:sSub>
       </m:oMath>
       <w:r>
-        <w:t xml:space="preserve">.</w:t>
+        <w:t xml:space="preserve">,</w:t>
+      </w:r>
+      <w:r>
+        <w:t xml:space="preserve"> </w:t>
+      </w:r>
+      <w:r>
+        <w:t xml:space="preserve">and the</w:t>
+      </w:r>
+      <w:r>
+        <w:t xml:space="preserve"> </w:t>
+      </w:r>
+      <w:hyperlink r:id="rId12">
+        <w:r>
+          <w:rPr>
+            <w:rStyle w:val="Hyperlink"/>
+          </w:rPr>
+          <w:t xml:space="preserve">channel capacity page</w:t>
+        </w:r>
+      </w:hyperlink>
+      <w:r>
+        <w:t xml:space="preserve"> </w:t>
+      </w:r>
+      <w:r>
+        <w:t xml:space="preserve">finds its error probability on a noisy channel.</w:t>
       </w:r>
     </w:p>
-    <w:bookmarkEnd w:id="12"/>
-    <w:bookmarkStart w:id="14" w:name="rem-shannon-vs-hamming"/>
+    <w:bookmarkEnd w:id="13"/>
+    <w:bookmarkStart w:id="16" w:name="rem-shannon-vs-hamming"/>
     <w:p>
       <w:pPr>
         <w:pStyle w:val="BodyText"/>
@@ -2085,7 +2165,7 @@
       <w:r>
         <w:t xml:space="preserve"> (Random errors and worst-case errors). </w:t>
       </w:r>
-      <w:hyperlink r:id="rId13">
+      <w:hyperlink r:id="rId14">
         <w:r>
           <w:rPr>
             <w:rStyle w:val="Hyperlink"/>
@@ -2127,13 +2207,39 @@
         <w:t xml:space="preserve"> </w:t>
       </w:r>
       <w:r>
-        <w:t xml:space="preserve">and found the highest rate at which a code can make</w:t>
-      </w:r>
-      <w:r>
-        <w:t xml:space="preserve"> </w:t>
-      </w:r>
-      <w:r>
-        <w:t xml:space="preserve">the probability of a decoding error as small as wanted.</w:t>
+        <w:t xml:space="preserve">and found that a code can make</w:t>
+      </w:r>
+      <w:r>
+        <w:t xml:space="preserve"> </w:t>
+      </w:r>
+      <w:r>
+        <w:t xml:space="preserve">the probability of a decoding error as small as wanted</w:t>
+      </w:r>
+      <w:r>
+        <w:t xml:space="preserve"> </w:t>
+      </w:r>
+      <w:r>
+        <w:t xml:space="preserve">at every rate below the</w:t>
+      </w:r>
+      <w:r>
+        <w:t xml:space="preserve"> </w:t>
+      </w:r>
+      <w:hyperlink r:id="rId15">
+        <w:r>
+          <w:rPr>
+            <w:rStyle w:val="Hyperlink"/>
+          </w:rPr>
+          <w:t xml:space="preserve">channel capacity</w:t>
+        </w:r>
+      </w:hyperlink>
+      <w:r>
+        <w:t xml:space="preserve">,</w:t>
+      </w:r>
+      <w:r>
+        <w:t xml:space="preserve"> </w:t>
+      </w:r>
+      <w:r>
+        <w:t xml:space="preserve">and at no rate above it.</w:t>
       </w:r>
       <w:r>
         <w:t xml:space="preserve"> </w:t>
@@ -2168,9 +2274,9 @@
         <w:t xml:space="preserve">which is the model complexity theory uses.</w:t>
       </w:r>
     </w:p>
-    <w:bookmarkEnd w:id="14"/>
-    <w:bookmarkEnd w:id="15"/>
-    <w:bookmarkStart w:id="20" w:name="sec-linear-codes"/>
+    <w:bookmarkEnd w:id="16"/>
+    <w:bookmarkEnd w:id="17"/>
+    <w:bookmarkStart w:id="22" w:name="sec-linear-codes"/>
     <w:p>
       <w:pPr>
         <w:pStyle w:val="Heading2"/>
@@ -2179,7 +2285,7 @@
         <w:t xml:space="preserve">2 Linear codes</w:t>
       </w:r>
     </w:p>
-    <w:bookmarkStart w:id="16" w:name="def-linear-code"/>
+    <w:bookmarkStart w:id="18" w:name="def-linear-code"/>
     <w:p>
       <w:pPr>
         <w:pStyle w:val="FirstParagraph"/>
@@ -2254,28 +2360,32 @@
           <m:t>=</m:t>
         </m:r>
         <m:r>
-          <m:rPr>
-            <m:sty m:val="p"/>
-          </m:rPr>
-          <m:t>{</m:t>
-        </m:r>
-        <m:r>
-          <m:t>0</m:t>
-        </m:r>
-        <m:r>
-          <m:rPr>
-            <m:sty m:val="p"/>
-          </m:rPr>
-          <m:t>,</m:t>
-        </m:r>
-        <m:r>
-          <m:t>1</m:t>
-        </m:r>
-        <m:r>
-          <m:rPr>
-            <m:sty m:val="p"/>
-          </m:rPr>
-          <m:t>}</m:t>
+          <m:t>​</m:t>
+        </m:r>
+        <m:d>
+          <m:dPr>
+            <m:begChr m:val="{"/>
+            <m:sepChr m:val=""/>
+            <m:endChr m:val="}"/>
+            <m:grow/>
+          </m:dPr>
+          <m:e>
+            <m:r>
+              <m:t>0</m:t>
+            </m:r>
+            <m:r>
+              <m:rPr>
+                <m:sty m:val="p"/>
+              </m:rPr>
+              <m:t>,</m:t>
+            </m:r>
+            <m:r>
+              <m:t>1</m:t>
+            </m:r>
+          </m:e>
+        </m:d>
+        <m:r>
+          <m:t>​</m:t>
         </m:r>
       </m:oMath>
       <w:r>
@@ -2497,67 +2607,71 @@
           <m:t>=</m:t>
         </m:r>
         <m:r>
-          <m:rPr>
-            <m:sty m:val="p"/>
-          </m:rPr>
-          <m:t>{</m:t>
-        </m:r>
-        <m:r>
-          <m:t>y</m:t>
-        </m:r>
-        <m:r>
-          <m:rPr>
-            <m:sty m:val="p"/>
-          </m:rPr>
-          <m:t>∈</m:t>
-        </m:r>
-        <m:sSubSup>
+          <m:t>​</m:t>
+        </m:r>
+        <m:d>
+          <m:dPr>
+            <m:begChr m:val="{"/>
+            <m:sepChr m:val=""/>
+            <m:endChr m:val="}"/>
+            <m:grow/>
+          </m:dPr>
           <m:e>
             <m:r>
+              <m:t>y</m:t>
+            </m:r>
+            <m:r>
               <m:rPr>
-                <m:scr m:val="double-struck"/>
                 <m:sty m:val="p"/>
               </m:rPr>
-              <m:t>F</m:t>
+              <m:t>∈</m:t>
+            </m:r>
+            <m:sSubSup>
+              <m:e>
+                <m:r>
+                  <m:rPr>
+                    <m:scr m:val="double-struck"/>
+                    <m:sty m:val="p"/>
+                  </m:rPr>
+                  <m:t>F</m:t>
+                </m:r>
+              </m:e>
+              <m:sub>
+                <m:r>
+                  <m:t>q</m:t>
+                </m:r>
+              </m:sub>
+              <m:sup>
+                <m:r>
+                  <m:t>n</m:t>
+                </m:r>
+              </m:sup>
+            </m:sSubSup>
+            <m:r>
+              <m:rPr>
+                <m:sty m:val="p"/>
+              </m:rPr>
+              <m:t>:</m:t>
+            </m:r>
+            <m:r>
+              <m:t>H</m:t>
+            </m:r>
+            <m:r>
+              <m:t>y</m:t>
+            </m:r>
+            <m:r>
+              <m:rPr>
+                <m:sty m:val="p"/>
+              </m:rPr>
+              <m:t>=</m:t>
+            </m:r>
+            <m:r>
+              <m:t>0</m:t>
             </m:r>
           </m:e>
-          <m:sub>
-            <m:r>
-              <m:t>q</m:t>
-            </m:r>
-          </m:sub>
-          <m:sup>
-            <m:r>
-              <m:t>n</m:t>
-            </m:r>
-          </m:sup>
-        </m:sSubSup>
-        <m:r>
-          <m:rPr>
-            <m:sty m:val="p"/>
-          </m:rPr>
-          <m:t>:</m:t>
-        </m:r>
-        <m:r>
-          <m:t>H</m:t>
-        </m:r>
-        <m:r>
-          <m:t>y</m:t>
-        </m:r>
-        <m:r>
-          <m:rPr>
-            <m:sty m:val="p"/>
-          </m:rPr>
-          <m:t>=</m:t>
-        </m:r>
-        <m:r>
-          <m:t>0</m:t>
-        </m:r>
-        <m:r>
-          <m:rPr>
-            <m:sty m:val="p"/>
-          </m:rPr>
-          <m:t>}</m:t>
+        </m:d>
+        <m:r>
+          <m:t>​</m:t>
         </m:r>
       </m:oMath>
       <w:r>
@@ -2644,39 +2758,43 @@
       </w:r>
       <m:oMath>
         <m:r>
-          <m:rPr>
-            <m:sty m:val="p"/>
-          </m:rPr>
-          <m:t>[</m:t>
-        </m:r>
-        <m:r>
-          <m:t>n</m:t>
-        </m:r>
-        <m:r>
-          <m:rPr>
-            <m:sty m:val="p"/>
-          </m:rPr>
-          <m:t>,</m:t>
-        </m:r>
-        <m:r>
-          <m:t>k</m:t>
-        </m:r>
-        <m:r>
-          <m:rPr>
-            <m:sty m:val="p"/>
-          </m:rPr>
-          <m:t>,</m:t>
-        </m:r>
-        <m:r>
-          <m:t>d</m:t>
-        </m:r>
-        <m:sSub>
+          <m:t>​</m:t>
+        </m:r>
+        <m:d>
+          <m:dPr>
+            <m:begChr m:val="["/>
+            <m:sepChr m:val=""/>
+            <m:endChr m:val="]"/>
+            <m:grow/>
+          </m:dPr>
           <m:e>
+            <m:r>
+              <m:t>n</m:t>
+            </m:r>
             <m:r>
               <m:rPr>
                 <m:sty m:val="p"/>
               </m:rPr>
-              <m:t>]</m:t>
+              <m:t>,</m:t>
+            </m:r>
+            <m:r>
+              <m:t>k</m:t>
+            </m:r>
+            <m:r>
+              <m:rPr>
+                <m:sty m:val="p"/>
+              </m:rPr>
+              <m:t>,</m:t>
+            </m:r>
+            <m:r>
+              <m:t>d</m:t>
+            </m:r>
+          </m:e>
+        </m:d>
+        <m:sSub>
+          <m:e>
+            <m:r>
+              <m:t>​</m:t>
             </m:r>
           </m:e>
           <m:sub>
@@ -2693,8 +2811,8 @@
         <w:t xml:space="preserve">code.</w:t>
       </w:r>
     </w:p>
-    <w:bookmarkEnd w:id="16"/>
-    <w:bookmarkStart w:id="17" w:name="def-weight"/>
+    <w:bookmarkEnd w:id="18"/>
+    <w:bookmarkStart w:id="19" w:name="def-weight"/>
     <w:p>
       <w:pPr>
         <w:pStyle w:val="BodyText"/>
@@ -2770,8 +2888,8 @@
         <w:t xml:space="preserve">is its number of nonzero symbols.</w:t>
       </w:r>
     </w:p>
-    <w:bookmarkEnd w:id="17"/>
-    <w:bookmarkStart w:id="18" w:name="rem-linear-code-weight"/>
+    <w:bookmarkEnd w:id="19"/>
+    <w:bookmarkStart w:id="20" w:name="rem-linear-code-weight"/>
     <w:p>
       <w:pPr>
         <w:pStyle w:val="BodyText"/>
@@ -2849,40 +2967,44 @@
           <m:t>Δ</m:t>
         </m:r>
         <m:r>
-          <m:rPr>
-            <m:sty m:val="p"/>
-          </m:rPr>
-          <m:t>(</m:t>
-        </m:r>
-        <m:r>
-          <m:t>c</m:t>
-        </m:r>
-        <m:r>
-          <m:rPr>
-            <m:sty m:val="p"/>
-          </m:rPr>
-          <m:t>,</m:t>
-        </m:r>
-        <m:sSup>
+          <m:t>​</m:t>
+        </m:r>
+        <m:d>
+          <m:dPr>
+            <m:begChr m:val="("/>
+            <m:sepChr m:val=""/>
+            <m:endChr m:val=")"/>
+            <m:grow/>
+          </m:dPr>
           <m:e>
             <m:r>
               <m:t>c</m:t>
             </m:r>
-          </m:e>
-          <m:sup>
             <m:r>
               <m:rPr>
                 <m:sty m:val="p"/>
               </m:rPr>
-              <m:t>′</m:t>
-            </m:r>
-          </m:sup>
-        </m:sSup>
-        <m:r>
-          <m:rPr>
-            <m:sty m:val="p"/>
-          </m:rPr>
-          <m:t>)</m:t>
+              <m:t>,</m:t>
+            </m:r>
+            <m:sSup>
+              <m:e>
+                <m:r>
+                  <m:t>c</m:t>
+                </m:r>
+              </m:e>
+              <m:sup>
+                <m:r>
+                  <m:rPr>
+                    <m:sty m:val="p"/>
+                  </m:rPr>
+                  <m:t>′</m:t>
+                </m:r>
+              </m:sup>
+            </m:sSup>
+          </m:e>
+        </m:d>
+        <m:r>
+          <m:t>​</m:t>
         </m:r>
       </m:oMath>
       <w:r>
@@ -2953,8 +3075,8 @@
         <w:t xml:space="preserve">So the minimum distance is the smallest weight of a nonzero codeword.</w:t>
       </w:r>
     </w:p>
-    <w:bookmarkEnd w:id="18"/>
-    <w:bookmarkStart w:id="19" w:name="exm-hamming-code"/>
+    <w:bookmarkEnd w:id="20"/>
+    <w:bookmarkStart w:id="21" w:name="exm-hamming-code"/>
     <w:p>
       <w:pPr>
         <w:pStyle w:val="BodyText"/>
@@ -3515,39 +3637,43 @@
       </w:r>
       <m:oMath>
         <m:r>
-          <m:rPr>
-            <m:sty m:val="p"/>
-          </m:rPr>
-          <m:t>[</m:t>
-        </m:r>
-        <m:r>
-          <m:t>7</m:t>
-        </m:r>
-        <m:r>
-          <m:rPr>
-            <m:sty m:val="p"/>
-          </m:rPr>
-          <m:t>,</m:t>
-        </m:r>
-        <m:r>
-          <m:t>4</m:t>
-        </m:r>
-        <m:r>
-          <m:rPr>
-            <m:sty m:val="p"/>
-          </m:rPr>
-          <m:t>,</m:t>
-        </m:r>
-        <m:r>
-          <m:t>3</m:t>
-        </m:r>
-        <m:sSub>
+          <m:t>​</m:t>
+        </m:r>
+        <m:d>
+          <m:dPr>
+            <m:begChr m:val="["/>
+            <m:sepChr m:val=""/>
+            <m:endChr m:val="]"/>
+            <m:grow/>
+          </m:dPr>
           <m:e>
+            <m:r>
+              <m:t>7</m:t>
+            </m:r>
             <m:r>
               <m:rPr>
                 <m:sty m:val="p"/>
               </m:rPr>
-              <m:t>]</m:t>
+              <m:t>,</m:t>
+            </m:r>
+            <m:r>
+              <m:t>4</m:t>
+            </m:r>
+            <m:r>
+              <m:rPr>
+                <m:sty m:val="p"/>
+              </m:rPr>
+              <m:t>,</m:t>
+            </m:r>
+            <m:r>
+              <m:t>3</m:t>
+            </m:r>
+          </m:e>
+        </m:d>
+        <m:sSub>
+          <m:e>
+            <m:r>
+              <m:t>​</m:t>
             </m:r>
           </m:e>
           <m:sub>
@@ -4017,9 +4143,9 @@
         <w:t xml:space="preserve">with its positions in a different order.</w:t>
       </w:r>
     </w:p>
-    <w:bookmarkEnd w:id="19"/>
-    <w:bookmarkEnd w:id="20"/>
-    <w:bookmarkStart w:id="25" w:name="sec-reed-solomon"/>
+    <w:bookmarkEnd w:id="21"/>
+    <w:bookmarkEnd w:id="22"/>
+    <w:bookmarkStart w:id="27" w:name="sec-reed-solomon"/>
     <w:p>
       <w:pPr>
         <w:pStyle w:val="Heading2"/>
@@ -4028,7 +4154,7 @@
         <w:t xml:space="preserve">3 Reed–Solomon codes</w:t>
       </w:r>
     </w:p>
-    <w:bookmarkStart w:id="21" w:name="thm-singleton-bound"/>
+    <w:bookmarkStart w:id="23" w:name="thm-singleton-bound"/>
     <w:p>
       <w:pPr>
         <w:pStyle w:val="FirstParagraph"/>
@@ -4175,7 +4301,7 @@
         <w:t xml:space="preserve">.</w:t>
       </w:r>
     </w:p>
-    <w:bookmarkEnd w:id="21"/>
+    <w:bookmarkEnd w:id="23"/>
     <w:p>
       <w:pPr>
         <w:pStyle w:val="BodyText"/>
@@ -4477,7 +4603,7 @@
         <w:t xml:space="preserve">.</w:t>
       </w:r>
     </w:p>
-    <w:bookmarkStart w:id="22" w:name="def-reed-solomon-code"/>
+    <w:bookmarkStart w:id="24" w:name="def-reed-solomon-code"/>
     <w:p>
       <w:pPr>
         <w:pStyle w:val="BodyText"/>
@@ -4986,6 +5112,9 @@
               </m:r>
             </m:lim>
           </m:limUpp>
+          <m:r>
+            <m:t>​</m:t>
+          </m:r>
           <m:d>
             <m:dPr>
               <m:begChr m:val="("/>
@@ -5087,6 +5216,9 @@
             </m:e>
           </m:d>
           <m:r>
+            <m:t>​</m:t>
+          </m:r>
+          <m:r>
             <m:rPr>
               <m:sty m:val="p"/>
             </m:rPr>
@@ -5109,8 +5241,8 @@
         <w:t xml:space="preserve">introduced these codes.</w:t>
       </w:r>
     </w:p>
-    <w:bookmarkEnd w:id="22"/>
-    <w:bookmarkStart w:id="23" w:name="thm-reed-solomon-distance"/>
+    <w:bookmarkEnd w:id="24"/>
+    <w:bookmarkStart w:id="25" w:name="thm-reed-solomon-distance"/>
     <w:p>
       <w:pPr>
         <w:pStyle w:val="BodyText"/>
@@ -5150,57 +5282,61 @@
       </w:r>
       <m:oMath>
         <m:r>
-          <m:rPr>
-            <m:sty m:val="p"/>
-          </m:rPr>
-          <m:t>[</m:t>
-        </m:r>
-        <m:r>
-          <m:t>n</m:t>
-        </m:r>
-        <m:r>
-          <m:rPr>
-            <m:sty m:val="p"/>
-          </m:rPr>
-          <m:t>,</m:t>
-        </m:r>
-        <m:r>
-          <m:t>k</m:t>
-        </m:r>
-        <m:r>
-          <m:rPr>
-            <m:sty m:val="p"/>
-          </m:rPr>
-          <m:t>,</m:t>
-        </m:r>
-        <m:r>
-          <m:t>n</m:t>
-        </m:r>
-        <m:r>
-          <m:rPr>
-            <m:sty m:val="p"/>
-          </m:rPr>
-          <m:t>−</m:t>
-        </m:r>
-        <m:r>
-          <m:t>k</m:t>
-        </m:r>
-        <m:r>
-          <m:rPr>
-            <m:sty m:val="p"/>
-          </m:rPr>
-          <m:t>+</m:t>
-        </m:r>
-        <m:r>
-          <m:t>1</m:t>
-        </m:r>
-        <m:sSub>
+          <m:t>​</m:t>
+        </m:r>
+        <m:d>
+          <m:dPr>
+            <m:begChr m:val="["/>
+            <m:sepChr m:val=""/>
+            <m:endChr m:val="]"/>
+            <m:grow/>
+          </m:dPr>
           <m:e>
+            <m:r>
+              <m:t>n</m:t>
+            </m:r>
             <m:r>
               <m:rPr>
                 <m:sty m:val="p"/>
               </m:rPr>
-              <m:t>]</m:t>
+              <m:t>,</m:t>
+            </m:r>
+            <m:r>
+              <m:t>k</m:t>
+            </m:r>
+            <m:r>
+              <m:rPr>
+                <m:sty m:val="p"/>
+              </m:rPr>
+              <m:t>,</m:t>
+            </m:r>
+            <m:r>
+              <m:t>n</m:t>
+            </m:r>
+            <m:r>
+              <m:rPr>
+                <m:sty m:val="p"/>
+              </m:rPr>
+              <m:t>−</m:t>
+            </m:r>
+            <m:r>
+              <m:t>k</m:t>
+            </m:r>
+            <m:r>
+              <m:rPr>
+                <m:sty m:val="p"/>
+              </m:rPr>
+              <m:t>+</m:t>
+            </m:r>
+            <m:r>
+              <m:t>1</m:t>
+            </m:r>
+          </m:e>
+        </m:d>
+        <m:sSub>
+          <m:e>
+            <m:r>
+              <m:t>​</m:t>
             </m:r>
           </m:e>
           <m:sub>
@@ -5225,7 +5361,7 @@
         <w:t xml:space="preserve">.</w:t>
       </w:r>
     </w:p>
-    <w:bookmarkEnd w:id="23"/>
+    <w:bookmarkEnd w:id="25"/>
     <w:p>
       <w:pPr>
         <w:pStyle w:val="BodyText"/>
@@ -5385,7 +5521,7 @@
           </m:e>
           <m:sub>
             <m:r>
-              <m:t>λ</m:t>
+              <m:t>b</m:t>
             </m:r>
             <m:r>
               <m:t>m</m:t>
@@ -5399,7 +5535,7 @@
           <m:t>=</m:t>
         </m:r>
         <m:r>
-          <m:t>λ</m:t>
+          <m:t>b</m:t>
         </m:r>
         <m:sSub>
           <m:e>
@@ -5425,8 +5561,30 @@
       </w:r>
       <m:oMath>
         <m:r>
-          <m:t>λ</m:t>
-        </m:r>
+          <m:t>b</m:t>
+        </m:r>
+        <m:r>
+          <m:rPr>
+            <m:sty m:val="p"/>
+          </m:rPr>
+          <m:t>∈</m:t>
+        </m:r>
+        <m:sSub>
+          <m:e>
+            <m:r>
+              <m:rPr>
+                <m:scr m:val="double-struck"/>
+                <m:sty m:val="p"/>
+              </m:rPr>
+              <m:t>F</m:t>
+            </m:r>
+          </m:e>
+          <m:sub>
+            <m:r>
+              <m:t>q</m:t>
+            </m:r>
+          </m:sub>
+        </m:sSub>
       </m:oMath>
       <w:r>
         <w:t xml:space="preserve">.</w:t>
@@ -5741,7 +5899,7 @@
         <w:t xml:space="preserve">.</w:t>
       </w:r>
     </w:p>
-    <w:bookmarkStart w:id="24" w:name="exm-reed-solomon"/>
+    <w:bookmarkStart w:id="26" w:name="exm-reed-solomon"/>
     <w:p>
       <w:pPr>
         <w:pStyle w:val="BodyText"/>
@@ -6355,9 +6513,9 @@
         <w:t xml:space="preserve">and the nearest codeword is the true line.</w:t>
       </w:r>
     </w:p>
-    <w:bookmarkEnd w:id="24"/>
-    <w:bookmarkEnd w:id="25"/>
-    <w:bookmarkStart w:id="35" w:name="sec-codes-to-complexity"/>
+    <w:bookmarkEnd w:id="26"/>
+    <w:bookmarkEnd w:id="27"/>
+    <w:bookmarkStart w:id="37" w:name="sec-codes-to-complexity"/>
     <w:p>
       <w:pPr>
         <w:pStyle w:val="Heading2"/>
@@ -6388,7 +6546,7 @@
       <w:r>
         <w:t xml:space="preserve"> </w:t>
       </w:r>
-      <w:hyperlink r:id="rId26">
+      <w:hyperlink r:id="rId28">
         <w:r>
           <w:rPr>
             <w:rStyle w:val="Hyperlink"/>
@@ -6405,7 +6563,7 @@
         <w:t xml:space="preserve">library covers the complexity classes these results are about.</w:t>
       </w:r>
     </w:p>
-    <w:bookmarkStart w:id="27" w:name="def-hadamard-code"/>
+    <w:bookmarkStart w:id="29" w:name="def-hadamard-code"/>
     <w:p>
       <w:pPr>
         <w:pStyle w:val="BodyText"/>
@@ -6475,6 +6633,29 @@
         </m:sSubSup>
       </m:oMath>
       <w:r>
+        <w:t xml:space="preserve">, for</w:t>
+      </w:r>
+      <w:r>
+        <w:t xml:space="preserve"> </w:t>
+      </w:r>
+      <m:oMath>
+        <m:r>
+          <m:t>k</m:t>
+        </m:r>
+        <m:r>
+          <m:rPr>
+            <m:sty m:val="p"/>
+          </m:rPr>
+          <m:t>≥</m:t>
+        </m:r>
+        <m:r>
+          <m:t>1</m:t>
+        </m:r>
+      </m:oMath>
+      <w:r>
+        <w:t xml:space="preserve">,</w:t>
+      </w:r>
+      <w:r>
         <w:t xml:space="preserve"> </w:t>
       </w:r>
       <w:r>
@@ -6501,7 +6682,7 @@
         <w:t xml:space="preserve"> </w:t>
       </w:r>
       <w:r>
-        <w:t xml:space="preserve">inner products</w:t>
+        <w:t xml:space="preserve">dot products</w:t>
       </w:r>
     </w:p>
     <w:p>
@@ -6514,28 +6695,16 @@
         </m:oMathParaPr>
         <m:oMath>
           <m:r>
-            <m:rPr>
-              <m:sty m:val="p"/>
-            </m:rPr>
-            <m:t>⟨</m:t>
-          </m:r>
-          <m:r>
             <m:t>x</m:t>
           </m:r>
           <m:r>
             <m:rPr>
               <m:sty m:val="p"/>
             </m:rPr>
-            <m:t>,</m:t>
+            <m:t>⋅</m:t>
           </m:r>
           <m:r>
             <m:t>a</m:t>
-          </m:r>
-          <m:r>
-            <m:rPr>
-              <m:sty m:val="p"/>
-            </m:rPr>
-            <m:t>⟩</m:t>
           </m:r>
           <m:r>
             <m:rPr>
@@ -6732,8 +6901,8 @@
         <w:t xml:space="preserve">call it the Walsh–Hadamard code.</w:t>
       </w:r>
     </w:p>
-    <w:bookmarkEnd w:id="27"/>
-    <w:bookmarkStart w:id="28" w:name="thm-hadamard-distance"/>
+    <w:bookmarkEnd w:id="29"/>
+    <w:bookmarkStart w:id="30" w:name="thm-hadamard-distance"/>
     <w:p>
       <w:pPr>
         <w:pStyle w:val="BodyText"/>
@@ -6826,7 +6995,7 @@
         <w:t xml:space="preserve">.</w:t>
       </w:r>
     </w:p>
-    <w:bookmarkEnd w:id="28"/>
+    <w:bookmarkEnd w:id="30"/>
     <w:p>
       <w:pPr>
         <w:pStyle w:val="BodyText"/>
@@ -6842,58 +7011,6 @@
         <w:t xml:space="preserve">. </w:t>
       </w:r>
       <w:r>
-        <w:t xml:space="preserve">Each inner product</w:t>
-      </w:r>
-      <w:r>
-        <w:t xml:space="preserve"> </w:t>
-      </w:r>
-      <m:oMath>
-        <m:r>
-          <m:rPr>
-            <m:sty m:val="p"/>
-          </m:rPr>
-          <m:t>⟨</m:t>
-        </m:r>
-        <m:r>
-          <m:t>x</m:t>
-        </m:r>
-        <m:r>
-          <m:rPr>
-            <m:sty m:val="p"/>
-          </m:rPr>
-          <m:t>,</m:t>
-        </m:r>
-        <m:r>
-          <m:t>a</m:t>
-        </m:r>
-        <m:r>
-          <m:rPr>
-            <m:sty m:val="p"/>
-          </m:rPr>
-          <m:t>⟩</m:t>
-        </m:r>
-      </m:oMath>
-      <w:r>
-        <w:t xml:space="preserve"> </w:t>
-      </w:r>
-      <w:r>
-        <w:t xml:space="preserve">is linear in</w:t>
-      </w:r>
-      <w:r>
-        <w:t xml:space="preserve"> </w:t>
-      </w:r>
-      <m:oMath>
-        <m:r>
-          <m:t>x</m:t>
-        </m:r>
-      </m:oMath>
-      <w:r>
-        <w:t xml:space="preserve">, so the code is linear.</w:t>
-      </w:r>
-      <w:r>
-        <w:t xml:space="preserve"> </w:t>
-      </w:r>
-      <w:r>
         <w:t xml:space="preserve">Let</w:t>
       </w:r>
       <w:r>
@@ -7013,20 +7130,106 @@
       </w:r>
       <m:oMath>
         <m:r>
-          <m:rPr>
-            <m:sty m:val="p"/>
-          </m:rPr>
-          <m:t>⟨</m:t>
-        </m:r>
-        <m:r>
           <m:t>x</m:t>
         </m:r>
         <m:r>
           <m:rPr>
             <m:sty m:val="p"/>
           </m:rPr>
-          <m:t>,</m:t>
-        </m:r>
+          <m:t>⋅</m:t>
+        </m:r>
+        <m:r>
+          <m:t>​</m:t>
+        </m:r>
+        <m:d>
+          <m:dPr>
+            <m:begChr m:val="("/>
+            <m:sepChr m:val=""/>
+            <m:endChr m:val=")"/>
+            <m:grow/>
+          </m:dPr>
+          <m:e>
+            <m:r>
+              <m:t>a</m:t>
+            </m:r>
+            <m:r>
+              <m:rPr>
+                <m:sty m:val="p"/>
+              </m:rPr>
+              <m:t>+</m:t>
+            </m:r>
+            <m:sSub>
+              <m:e>
+                <m:r>
+                  <m:t>e</m:t>
+                </m:r>
+              </m:e>
+              <m:sub>
+                <m:r>
+                  <m:t>i</m:t>
+                </m:r>
+              </m:sub>
+            </m:sSub>
+          </m:e>
+        </m:d>
+        <m:r>
+          <m:t>​</m:t>
+        </m:r>
+        <m:r>
+          <m:rPr>
+            <m:sty m:val="p"/>
+          </m:rPr>
+          <m:t>=</m:t>
+        </m:r>
+        <m:r>
+          <m:t>x</m:t>
+        </m:r>
+        <m:r>
+          <m:rPr>
+            <m:sty m:val="p"/>
+          </m:rPr>
+          <m:t>⋅</m:t>
+        </m:r>
+        <m:r>
+          <m:t>a</m:t>
+        </m:r>
+        <m:r>
+          <m:rPr>
+            <m:sty m:val="p"/>
+          </m:rPr>
+          <m:t>+</m:t>
+        </m:r>
+        <m:r>
+          <m:t>1</m:t>
+        </m:r>
+      </m:oMath>
+      <w:r>
+        <w:t xml:space="preserve">,</w:t>
+      </w:r>
+      <w:r>
+        <w:t xml:space="preserve"> </w:t>
+      </w:r>
+      <w:r>
+        <w:t xml:space="preserve">so pairing each</w:t>
+      </w:r>
+      <w:r>
+        <w:t xml:space="preserve"> </w:t>
+      </w:r>
+      <m:oMath>
+        <m:r>
+          <m:t>a</m:t>
+        </m:r>
+      </m:oMath>
+      <w:r>
+        <w:t xml:space="preserve"> </w:t>
+      </w:r>
+      <w:r>
+        <w:t xml:space="preserve">with</w:t>
+      </w:r>
+      <w:r>
+        <w:t xml:space="preserve"> </w:t>
+      </w:r>
+      <m:oMath>
         <m:r>
           <m:t>a</m:t>
         </m:r>
@@ -7048,100 +7251,6 @@
             </m:r>
           </m:sub>
         </m:sSub>
-        <m:r>
-          <m:rPr>
-            <m:sty m:val="p"/>
-          </m:rPr>
-          <m:t>⟩</m:t>
-        </m:r>
-        <m:r>
-          <m:rPr>
-            <m:sty m:val="p"/>
-          </m:rPr>
-          <m:t>=</m:t>
-        </m:r>
-        <m:r>
-          <m:rPr>
-            <m:sty m:val="p"/>
-          </m:rPr>
-          <m:t>⟨</m:t>
-        </m:r>
-        <m:r>
-          <m:t>x</m:t>
-        </m:r>
-        <m:r>
-          <m:rPr>
-            <m:sty m:val="p"/>
-          </m:rPr>
-          <m:t>,</m:t>
-        </m:r>
-        <m:r>
-          <m:t>a</m:t>
-        </m:r>
-        <m:r>
-          <m:rPr>
-            <m:sty m:val="p"/>
-          </m:rPr>
-          <m:t>⟩</m:t>
-        </m:r>
-        <m:r>
-          <m:rPr>
-            <m:sty m:val="p"/>
-          </m:rPr>
-          <m:t>+</m:t>
-        </m:r>
-        <m:r>
-          <m:t>1</m:t>
-        </m:r>
-      </m:oMath>
-      <w:r>
-        <w:t xml:space="preserve">,</w:t>
-      </w:r>
-      <w:r>
-        <w:t xml:space="preserve"> </w:t>
-      </w:r>
-      <w:r>
-        <w:t xml:space="preserve">so pairing each</w:t>
-      </w:r>
-      <w:r>
-        <w:t xml:space="preserve"> </w:t>
-      </w:r>
-      <m:oMath>
-        <m:r>
-          <m:t>a</m:t>
-        </m:r>
-      </m:oMath>
-      <w:r>
-        <w:t xml:space="preserve"> </w:t>
-      </w:r>
-      <w:r>
-        <w:t xml:space="preserve">with</w:t>
-      </w:r>
-      <w:r>
-        <w:t xml:space="preserve"> </w:t>
-      </w:r>
-      <m:oMath>
-        <m:r>
-          <m:t>a</m:t>
-        </m:r>
-        <m:r>
-          <m:rPr>
-            <m:sty m:val="p"/>
-          </m:rPr>
-          <m:t>+</m:t>
-        </m:r>
-        <m:sSub>
-          <m:e>
-            <m:r>
-              <m:t>e</m:t>
-            </m:r>
-          </m:e>
-          <m:sub>
-            <m:r>
-              <m:t>i</m:t>
-            </m:r>
-          </m:sub>
-        </m:sSub>
       </m:oMath>
       <w:r>
         <w:t xml:space="preserve"> </w:t>
@@ -7196,7 +7305,7 @@
         <w:t xml:space="preserve"> </w:t>
       </w:r>
       <w:r>
-        <w:t xml:space="preserve">So every nonzero codeword has</w:t>
+        <w:t xml:space="preserve">So every nonzero message has a codeword of</w:t>
       </w:r>
       <w:r>
         <w:t xml:space="preserve"> </w:t>
@@ -7234,6 +7343,55 @@
             </m:r>
           </m:sup>
         </m:sSup>
+        <m:r>
+          <m:rPr>
+            <m:sty m:val="p"/>
+          </m:rPr>
+          <m:t>≥</m:t>
+        </m:r>
+        <m:r>
+          <m:t>1</m:t>
+        </m:r>
+      </m:oMath>
+      <w:r>
+        <w:t xml:space="preserve">.</w:t>
+      </w:r>
+      <w:r>
+        <w:t xml:space="preserve"> </w:t>
+      </w:r>
+      <w:r>
+        <w:t xml:space="preserve">Each dot product</w:t>
+      </w:r>
+      <w:r>
+        <w:t xml:space="preserve"> </w:t>
+      </w:r>
+      <m:oMath>
+        <m:r>
+          <m:t>x</m:t>
+        </m:r>
+        <m:r>
+          <m:rPr>
+            <m:sty m:val="p"/>
+          </m:rPr>
+          <m:t>⋅</m:t>
+        </m:r>
+        <m:r>
+          <m:t>a</m:t>
+        </m:r>
+      </m:oMath>
+      <w:r>
+        <w:t xml:space="preserve"> </w:t>
+      </w:r>
+      <w:r>
+        <w:t xml:space="preserve">is linear in</w:t>
+      </w:r>
+      <w:r>
+        <w:t xml:space="preserve"> </w:t>
+      </w:r>
+      <m:oMath>
+        <m:r>
+          <m:t>x</m:t>
+        </m:r>
       </m:oMath>
       <w:r>
         <w:t xml:space="preserve">,</w:t>
@@ -7242,7 +7400,25 @@
         <w:t xml:space="preserve"> </w:t>
       </w:r>
       <w:r>
-        <w:t xml:space="preserve">and</w:t>
+        <w:t xml:space="preserve">so the encoding map is linear,</w:t>
+      </w:r>
+      <w:r>
+        <w:t xml:space="preserve"> </w:t>
+      </w:r>
+      <w:r>
+        <w:t xml:space="preserve">and only the zero message has the zero codeword,</w:t>
+      </w:r>
+      <w:r>
+        <w:t xml:space="preserve"> </w:t>
+      </w:r>
+      <w:r>
+        <w:t xml:space="preserve">so the map is one-to-one and the code is linear.</w:t>
+      </w:r>
+      <w:r>
+        <w:t xml:space="preserve"> </w:t>
+      </w:r>
+      <w:r>
+        <w:t xml:space="preserve">Then</w:t>
       </w:r>
       <w:r>
         <w:t xml:space="preserve"> </w:t>
@@ -7262,7 +7438,7 @@
         <w:t xml:space="preserve">gives the minimum distance.</w:t>
       </w:r>
     </w:p>
-    <w:bookmarkStart w:id="29" w:name="exm-hadamard-code"/>
+    <w:bookmarkStart w:id="31" w:name="exm-hadamard-code"/>
     <w:p>
       <w:pPr>
         <w:pStyle w:val="BodyText"/>
@@ -7458,28 +7634,16 @@
       </w:r>
       <m:oMath>
         <m:r>
-          <m:rPr>
-            <m:sty m:val="p"/>
-          </m:rPr>
-          <m:t>⟨</m:t>
-        </m:r>
-        <m:r>
           <m:t>x</m:t>
         </m:r>
         <m:r>
           <m:rPr>
             <m:sty m:val="p"/>
           </m:rPr>
-          <m:t>,</m:t>
+          <m:t>⋅</m:t>
         </m:r>
         <m:r>
           <m:t>a</m:t>
-        </m:r>
-        <m:r>
-          <m:rPr>
-            <m:sty m:val="p"/>
-          </m:rPr>
-          <m:t>⟩</m:t>
         </m:r>
         <m:r>
           <m:rPr>
@@ -7543,28 +7707,16 @@
       </w:r>
       <m:oMath>
         <m:r>
-          <m:rPr>
-            <m:sty m:val="p"/>
-          </m:rPr>
-          <m:t>⟨</m:t>
-        </m:r>
-        <m:r>
           <m:t>x</m:t>
         </m:r>
         <m:r>
           <m:rPr>
             <m:sty m:val="p"/>
           </m:rPr>
-          <m:t>,</m:t>
+          <m:t>⋅</m:t>
         </m:r>
         <m:r>
           <m:t>a</m:t>
-        </m:r>
-        <m:r>
-          <m:rPr>
-            <m:sty m:val="p"/>
-          </m:rPr>
-          <m:t>⟩</m:t>
         </m:r>
         <m:r>
           <m:rPr>
@@ -7628,28 +7780,16 @@
       </w:r>
       <m:oMath>
         <m:r>
-          <m:rPr>
-            <m:sty m:val="p"/>
-          </m:rPr>
-          <m:t>⟨</m:t>
-        </m:r>
-        <m:r>
           <m:t>x</m:t>
         </m:r>
         <m:r>
           <m:rPr>
             <m:sty m:val="p"/>
           </m:rPr>
-          <m:t>,</m:t>
+          <m:t>⋅</m:t>
         </m:r>
         <m:r>
           <m:t>a</m:t>
-        </m:r>
-        <m:r>
-          <m:rPr>
-            <m:sty m:val="p"/>
-          </m:rPr>
-          <m:t>⟩</m:t>
         </m:r>
         <m:r>
           <m:rPr>
@@ -7779,8 +7919,8 @@
         <w:t xml:space="preserve">says.</w:t>
       </w:r>
     </w:p>
-    <w:bookmarkEnd w:id="29"/>
-    <w:bookmarkStart w:id="30" w:name="thm-hadamard-local-decoding"/>
+    <w:bookmarkEnd w:id="31"/>
+    <w:bookmarkStart w:id="32" w:name="thm-hadamard-local-decoding"/>
     <w:p>
       <w:pPr>
         <w:pStyle w:val="BodyText"/>
@@ -7790,7 +7930,7 @@
           <w:b/>
           <w:bCs/>
         </w:rPr>
-        <w:t xml:space="preserve">Theorem 5 (The Hadamard code is locally decodable)</w:t>
+        <w:t xml:space="preserve">Theorem 5 (Two-query decoding of the Hadamard code)</w:t>
       </w:r>
       <w:r>
         <w:t xml:space="preserve"> </w:t>
@@ -7976,40 +8116,44 @@
           <m:t>∈</m:t>
         </m:r>
         <m:r>
-          <m:rPr>
-            <m:sty m:val="p"/>
-          </m:rPr>
-          <m:t>{</m:t>
-        </m:r>
-        <m:r>
-          <m:t>1</m:t>
-        </m:r>
-        <m:r>
-          <m:rPr>
-            <m:sty m:val="p"/>
-          </m:rPr>
-          <m:t>,</m:t>
-        </m:r>
-        <m:r>
-          <m:rPr>
-            <m:sty m:val="p"/>
-          </m:rPr>
-          <m:t>…</m:t>
-        </m:r>
-        <m:r>
-          <m:rPr>
-            <m:sty m:val="p"/>
-          </m:rPr>
-          <m:t>,</m:t>
-        </m:r>
-        <m:r>
-          <m:t>k</m:t>
-        </m:r>
-        <m:r>
-          <m:rPr>
-            <m:sty m:val="p"/>
-          </m:rPr>
-          <m:t>}</m:t>
+          <m:t>​</m:t>
+        </m:r>
+        <m:d>
+          <m:dPr>
+            <m:begChr m:val="{"/>
+            <m:sepChr m:val=""/>
+            <m:endChr m:val="}"/>
+            <m:grow/>
+          </m:dPr>
+          <m:e>
+            <m:r>
+              <m:t>1</m:t>
+            </m:r>
+            <m:r>
+              <m:rPr>
+                <m:sty m:val="p"/>
+              </m:rPr>
+              <m:t>,</m:t>
+            </m:r>
+            <m:r>
+              <m:rPr>
+                <m:sty m:val="p"/>
+              </m:rPr>
+              <m:t>…</m:t>
+            </m:r>
+            <m:r>
+              <m:rPr>
+                <m:sty m:val="p"/>
+              </m:rPr>
+              <m:t>,</m:t>
+            </m:r>
+            <m:r>
+              <m:t>k</m:t>
+            </m:r>
+          </m:e>
+        </m:d>
+        <m:r>
+          <m:t>​</m:t>
         </m:r>
       </m:oMath>
       <w:r>
@@ -8169,6 +8313,33 @@
           </m:rPr>
           <m:t>)</m:t>
         </m:r>
+        <m:r>
+          <m:t> </m:t>
+        </m:r>
+        <m:r>
+          <m:rPr>
+            <m:sty m:val="p"/>
+          </m:rPr>
+          <m:t>(</m:t>
+        </m:r>
+        <m:r>
+          <m:rPr>
+            <m:sty m:val="p"/>
+          </m:rPr>
+          <m:t>mod</m:t>
+        </m:r>
+        <m:r>
+          <m:t> </m:t>
+        </m:r>
+        <m:r>
+          <m:t>2</m:t>
+        </m:r>
+        <m:r>
+          <m:rPr>
+            <m:sty m:val="p"/>
+          </m:rPr>
+          <m:t>)</m:t>
+        </m:r>
       </m:oMath>
       <w:r>
         <w:t xml:space="preserve">.</w:t>
@@ -8226,7 +8397,7 @@
         <w:t xml:space="preserve">.</w:t>
       </w:r>
     </w:p>
-    <w:bookmarkEnd w:id="30"/>
+    <w:bookmarkEnd w:id="32"/>
     <w:p>
       <w:pPr>
         <w:pStyle w:val="BodyText"/>
@@ -8458,49 +8629,13 @@
         </m:oMathParaPr>
         <m:oMath>
           <m:r>
-            <m:rPr>
-              <m:sty m:val="p"/>
-            </m:rPr>
-            <m:t>⟨</m:t>
-          </m:r>
-          <m:r>
             <m:t>x</m:t>
           </m:r>
           <m:r>
             <m:rPr>
               <m:sty m:val="p"/>
             </m:rPr>
-            <m:t>,</m:t>
-          </m:r>
-          <m:r>
-            <m:t>a</m:t>
-          </m:r>
-          <m:r>
-            <m:rPr>
-              <m:sty m:val="p"/>
-            </m:rPr>
-            <m:t>⟩</m:t>
-          </m:r>
-          <m:r>
-            <m:rPr>
-              <m:sty m:val="p"/>
-            </m:rPr>
-            <m:t>+</m:t>
-          </m:r>
-          <m:r>
-            <m:rPr>
-              <m:sty m:val="p"/>
-            </m:rPr>
-            <m:t>⟨</m:t>
-          </m:r>
-          <m:r>
-            <m:t>x</m:t>
-          </m:r>
-          <m:r>
-            <m:rPr>
-              <m:sty m:val="p"/>
-            </m:rPr>
-            <m:t>,</m:t>
+            <m:t>⋅</m:t>
           </m:r>
           <m:r>
             <m:t>a</m:t>
@@ -8510,6 +8645,67 @@
               <m:sty m:val="p"/>
             </m:rPr>
             <m:t>+</m:t>
+          </m:r>
+          <m:r>
+            <m:t>x</m:t>
+          </m:r>
+          <m:r>
+            <m:rPr>
+              <m:sty m:val="p"/>
+            </m:rPr>
+            <m:t>⋅</m:t>
+          </m:r>
+          <m:r>
+            <m:t>​</m:t>
+          </m:r>
+          <m:d>
+            <m:dPr>
+              <m:begChr m:val="("/>
+              <m:sepChr m:val=""/>
+              <m:endChr m:val=")"/>
+              <m:grow/>
+            </m:dPr>
+            <m:e>
+              <m:r>
+                <m:t>a</m:t>
+              </m:r>
+              <m:r>
+                <m:rPr>
+                  <m:sty m:val="p"/>
+                </m:rPr>
+                <m:t>+</m:t>
+              </m:r>
+              <m:sSub>
+                <m:e>
+                  <m:r>
+                    <m:t>e</m:t>
+                  </m:r>
+                </m:e>
+                <m:sub>
+                  <m:r>
+                    <m:t>i</m:t>
+                  </m:r>
+                </m:sub>
+              </m:sSub>
+            </m:e>
+          </m:d>
+          <m:r>
+            <m:t>​</m:t>
+          </m:r>
+          <m:r>
+            <m:rPr>
+              <m:sty m:val="p"/>
+            </m:rPr>
+            <m:t>=</m:t>
+          </m:r>
+          <m:r>
+            <m:t>x</m:t>
+          </m:r>
+          <m:r>
+            <m:rPr>
+              <m:sty m:val="p"/>
+            </m:rPr>
+            <m:t>⋅</m:t>
           </m:r>
           <m:sSub>
             <m:e>
@@ -8523,51 +8719,6 @@
               </m:r>
             </m:sub>
           </m:sSub>
-          <m:r>
-            <m:rPr>
-              <m:sty m:val="p"/>
-            </m:rPr>
-            <m:t>⟩</m:t>
-          </m:r>
-          <m:r>
-            <m:rPr>
-              <m:sty m:val="p"/>
-            </m:rPr>
-            <m:t>=</m:t>
-          </m:r>
-          <m:r>
-            <m:rPr>
-              <m:sty m:val="p"/>
-            </m:rPr>
-            <m:t>⟨</m:t>
-          </m:r>
-          <m:r>
-            <m:t>x</m:t>
-          </m:r>
-          <m:r>
-            <m:rPr>
-              <m:sty m:val="p"/>
-            </m:rPr>
-            <m:t>,</m:t>
-          </m:r>
-          <m:sSub>
-            <m:e>
-              <m:r>
-                <m:t>e</m:t>
-              </m:r>
-            </m:e>
-            <m:sub>
-              <m:r>
-                <m:t>i</m:t>
-              </m:r>
-            </m:sub>
-          </m:sSub>
-          <m:r>
-            <m:rPr>
-              <m:sty m:val="p"/>
-            </m:rPr>
-            <m:t>⟩</m:t>
-          </m:r>
           <m:r>
             <m:rPr>
               <m:sty m:val="p"/>
@@ -8607,19 +8758,13 @@
       </w:r>
       <m:oMath>
         <m:r>
-          <m:rPr>
-            <m:sty m:val="p"/>
-          </m:rPr>
-          <m:t>⟨</m:t>
-        </m:r>
-        <m:r>
           <m:t>x</m:t>
         </m:r>
         <m:r>
           <m:rPr>
             <m:sty m:val="p"/>
           </m:rPr>
-          <m:t>,</m:t>
+          <m:t>⋅</m:t>
         </m:r>
         <m:r>
           <m:t>a</m:t>
@@ -8628,28 +8773,16 @@
           <m:rPr>
             <m:sty m:val="p"/>
           </m:rPr>
-          <m:t>⟩</m:t>
-        </m:r>
-        <m:r>
-          <m:rPr>
-            <m:sty m:val="p"/>
-          </m:rPr>
           <m:t>+</m:t>
         </m:r>
         <m:r>
-          <m:rPr>
-            <m:sty m:val="p"/>
-          </m:rPr>
-          <m:t>⟨</m:t>
-        </m:r>
-        <m:r>
           <m:t>x</m:t>
         </m:r>
         <m:r>
           <m:rPr>
             <m:sty m:val="p"/>
           </m:rPr>
-          <m:t>,</m:t>
+          <m:t>⋅</m:t>
         </m:r>
         <m:r>
           <m:t>a</m:t>
@@ -8658,12 +8791,6 @@
           <m:rPr>
             <m:sty m:val="p"/>
           </m:rPr>
-          <m:t>⟩</m:t>
-        </m:r>
-        <m:r>
-          <m:rPr>
-            <m:sty m:val="p"/>
-          </m:rPr>
           <m:t>=</m:t>
         </m:r>
         <m:r>
@@ -8677,7 +8804,7 @@
         <w:t xml:space="preserve">modulo 2.</w:t>
       </w:r>
     </w:p>
-    <w:bookmarkStart w:id="31" w:name="def-locally-decodable"/>
+    <w:bookmarkStart w:id="33" w:name="def-locally-decodable"/>
     <w:p>
       <w:pPr>
         <w:pStyle w:val="BodyText"/>
@@ -8768,7 +8895,87 @@
         <w:t xml:space="preserve"> </w:t>
       </w:r>
       <w:r>
-        <w:t xml:space="preserve">Given an index</w:t>
+        <w:t xml:space="preserve">For every message</w:t>
+      </w:r>
+      <w:r>
+        <w:t xml:space="preserve"> </w:t>
+      </w:r>
+      <m:oMath>
+        <m:r>
+          <m:t>x</m:t>
+        </m:r>
+      </m:oMath>
+      <w:r>
+        <w:t xml:space="preserve">,</w:t>
+      </w:r>
+      <w:r>
+        <w:t xml:space="preserve"> </w:t>
+      </w:r>
+      <w:r>
+        <w:t xml:space="preserve">every word</w:t>
+      </w:r>
+      <w:r>
+        <w:t xml:space="preserve"> </w:t>
+      </w:r>
+      <m:oMath>
+        <m:r>
+          <m:t>w</m:t>
+        </m:r>
+      </m:oMath>
+      <w:r>
+        <w:t xml:space="preserve"> </w:t>
+      </w:r>
+      <w:r>
+        <w:t xml:space="preserve">that differs from</w:t>
+      </w:r>
+      <w:r>
+        <w:t xml:space="preserve"> </w:t>
+      </w:r>
+      <m:oMath>
+        <m:r>
+          <m:t>E</m:t>
+        </m:r>
+        <m:r>
+          <m:rPr>
+            <m:sty m:val="p"/>
+          </m:rPr>
+          <m:t>(</m:t>
+        </m:r>
+        <m:r>
+          <m:t>x</m:t>
+        </m:r>
+        <m:r>
+          <m:rPr>
+            <m:sty m:val="p"/>
+          </m:rPr>
+          <m:t>)</m:t>
+        </m:r>
+      </m:oMath>
+      <w:r>
+        <w:t xml:space="preserve"> </w:t>
+      </w:r>
+      <w:r>
+        <w:t xml:space="preserve">in at most a fraction</w:t>
+      </w:r>
+      <w:r>
+        <w:t xml:space="preserve"> </w:t>
+      </w:r>
+      <m:oMath>
+        <m:r>
+          <m:t>δ</m:t>
+        </m:r>
+      </m:oMath>
+      <w:r>
+        <w:t xml:space="preserve"> </w:t>
+      </w:r>
+      <w:r>
+        <w:t xml:space="preserve">of its positions,</w:t>
+      </w:r>
+      <w:r>
+        <w:t xml:space="preserve"> </w:t>
+      </w:r>
+      <w:r>
+        <w:t xml:space="preserve">and every index</w:t>
       </w:r>
       <w:r>
         <w:t xml:space="preserve"> </w:t>
@@ -8779,10 +8986,27 @@
         </m:r>
       </m:oMath>
       <w:r>
-        <w:t xml:space="preserve"> </w:t>
-      </w:r>
-      <w:r>
-        <w:t xml:space="preserve">and access to any word</w:t>
+        <w:t xml:space="preserve">,</w:t>
+      </w:r>
+      <w:r>
+        <w:t xml:space="preserve"> </w:t>
+      </w:r>
+      <w:r>
+        <w:t xml:space="preserve">the decoder, given</w:t>
+      </w:r>
+      <w:r>
+        <w:t xml:space="preserve"> </w:t>
+      </w:r>
+      <m:oMath>
+        <m:r>
+          <m:t>i</m:t>
+        </m:r>
+      </m:oMath>
+      <w:r>
+        <w:t xml:space="preserve"> </w:t>
+      </w:r>
+      <w:r>
+        <w:t xml:space="preserve">and access to</w:t>
       </w:r>
       <w:r>
         <w:t xml:space="preserve"> </w:t>
@@ -8793,59 +9017,7 @@
         </m:r>
       </m:oMath>
       <w:r>
-        <w:t xml:space="preserve"> </w:t>
-      </w:r>
-      <w:r>
-        <w:t xml:space="preserve">that differs from some codeword</w:t>
-      </w:r>
-      <w:r>
-        <w:t xml:space="preserve"> </w:t>
-      </w:r>
-      <m:oMath>
-        <m:r>
-          <m:t>E</m:t>
-        </m:r>
-        <m:r>
-          <m:rPr>
-            <m:sty m:val="p"/>
-          </m:rPr>
-          <m:t>(</m:t>
-        </m:r>
-        <m:r>
-          <m:t>x</m:t>
-        </m:r>
-        <m:r>
-          <m:rPr>
-            <m:sty m:val="p"/>
-          </m:rPr>
-          <m:t>)</m:t>
-        </m:r>
-      </m:oMath>
-      <w:r>
-        <w:t xml:space="preserve"> </w:t>
-      </w:r>
-      <w:r>
-        <w:t xml:space="preserve">in at most a fraction</w:t>
-      </w:r>
-      <w:r>
-        <w:t xml:space="preserve"> </w:t>
-      </w:r>
-      <m:oMath>
-        <m:r>
-          <m:t>δ</m:t>
-        </m:r>
-      </m:oMath>
-      <w:r>
-        <w:t xml:space="preserve"> </w:t>
-      </w:r>
-      <w:r>
-        <w:t xml:space="preserve">of its positions,</w:t>
-      </w:r>
-      <w:r>
-        <w:t xml:space="preserve"> </w:t>
-      </w:r>
-      <w:r>
-        <w:t xml:space="preserve">the decoder reads at most</w:t>
+        <w:t xml:space="preserve">, reads at most</w:t>
       </w:r>
       <w:r>
         <w:t xml:space="preserve"> </w:t>
@@ -8916,11 +9088,14 @@
         </m:r>
       </m:oMath>
       <w:r>
-        <w:t xml:space="preserve">.</w:t>
+        <w:t xml:space="preserve"> </w:t>
+      </w:r>
+      <w:r>
+        <w:t xml:space="preserve">over its random choices.</w:t>
       </w:r>
     </w:p>
-    <w:bookmarkEnd w:id="31"/>
-    <w:bookmarkStart w:id="32" w:name="rem-local-decoding"/>
+    <w:bookmarkEnd w:id="33"/>
+    <w:bookmarkStart w:id="34" w:name="rem-local-decoding"/>
     <w:p>
       <w:pPr>
         <w:pStyle w:val="BodyText"/>
@@ -9150,30 +9325,7 @@
         <w:t xml:space="preserve"> </w:t>
       </w:r>
       <w:r>
-        <w:t xml:space="preserve">instead reads all</w:t>
-      </w:r>
-      <w:r>
-        <w:t xml:space="preserve"> </w:t>
-      </w:r>
-      <m:oMath>
-        <m:sSup>
-          <m:e>
-            <m:r>
-              <m:t>2</m:t>
-            </m:r>
-          </m:e>
-          <m:sup>
-            <m:r>
-              <m:t>k</m:t>
-            </m:r>
-          </m:sup>
-        </m:sSup>
-      </m:oMath>
-      <w:r>
-        <w:t xml:space="preserve"> </w:t>
-      </w:r>
-      <w:r>
-        <w:t xml:space="preserve">symbols.</w:t>
+        <w:t xml:space="preserve">instead reads the whole received word.</w:t>
       </w:r>
       <w:r>
         <w:t xml:space="preserve"> </w:t>
@@ -9243,8 +9395,8 @@
         <w:t xml:space="preserve">.</w:t>
       </w:r>
     </w:p>
-    <w:bookmarkEnd w:id="32"/>
-    <w:bookmarkStart w:id="33" w:name="rem-hardness-amplification"/>
+    <w:bookmarkEnd w:id="34"/>
+    <w:bookmarkStart w:id="35" w:name="rem-hardness-amplification"/>
     <w:p>
       <w:pPr>
         <w:pStyle w:val="BodyText"/>
@@ -9276,35 +9428,39 @@
           <m:t>:</m:t>
         </m:r>
         <m:r>
-          <m:rPr>
-            <m:sty m:val="p"/>
-          </m:rPr>
-          <m:t>{</m:t>
-        </m:r>
-        <m:r>
-          <m:t>0</m:t>
-        </m:r>
-        <m:r>
-          <m:rPr>
-            <m:sty m:val="p"/>
-          </m:rPr>
-          <m:t>,</m:t>
-        </m:r>
-        <m:r>
-          <m:t>1</m:t>
-        </m:r>
-        <m:sSup>
+          <m:t>​</m:t>
+        </m:r>
+        <m:d>
+          <m:dPr>
+            <m:begChr m:val="{"/>
+            <m:sepChr m:val=""/>
+            <m:endChr m:val="}"/>
+            <m:grow/>
+          </m:dPr>
           <m:e>
+            <m:r>
+              <m:t>0</m:t>
+            </m:r>
             <m:r>
               <m:rPr>
                 <m:sty m:val="p"/>
               </m:rPr>
-              <m:t>}</m:t>
+              <m:t>,</m:t>
+            </m:r>
+            <m:r>
+              <m:t>1</m:t>
+            </m:r>
+          </m:e>
+        </m:d>
+        <m:sSup>
+          <m:e>
+            <m:r>
+              <m:t>​</m:t>
             </m:r>
           </m:e>
           <m:sup>
             <m:r>
-              <m:t>ℓ</m:t>
+              <m:t>s</m:t>
             </m:r>
           </m:sup>
         </m:sSup>
@@ -9315,28 +9471,32 @@
           <m:t>→</m:t>
         </m:r>
         <m:r>
-          <m:rPr>
-            <m:sty m:val="p"/>
-          </m:rPr>
-          <m:t>{</m:t>
-        </m:r>
-        <m:r>
-          <m:t>0</m:t>
-        </m:r>
-        <m:r>
-          <m:rPr>
-            <m:sty m:val="p"/>
-          </m:rPr>
-          <m:t>,</m:t>
-        </m:r>
-        <m:r>
-          <m:t>1</m:t>
-        </m:r>
-        <m:r>
-          <m:rPr>
-            <m:sty m:val="p"/>
-          </m:rPr>
-          <m:t>}</m:t>
+          <m:t>​</m:t>
+        </m:r>
+        <m:d>
+          <m:dPr>
+            <m:begChr m:val="{"/>
+            <m:sepChr m:val=""/>
+            <m:endChr m:val="}"/>
+            <m:grow/>
+          </m:dPr>
+          <m:e>
+            <m:r>
+              <m:t>0</m:t>
+            </m:r>
+            <m:r>
+              <m:rPr>
+                <m:sty m:val="p"/>
+              </m:rPr>
+              <m:t>,</m:t>
+            </m:r>
+            <m:r>
+              <m:t>1</m:t>
+            </m:r>
+          </m:e>
+        </m:d>
+        <m:r>
+          <m:t>​</m:t>
         </m:r>
       </m:oMath>
       <w:r>
@@ -9370,7 +9530,7 @@
           </m:e>
           <m:sup>
             <m:r>
-              <m:t>ℓ</m:t>
+              <m:t>s</m:t>
             </m:r>
           </m:sup>
         </m:sSup>
@@ -9388,7 +9548,24 @@
         <w:t xml:space="preserve"> </w:t>
       </w:r>
       <w:r>
-        <w:t xml:space="preserve">Encode the truth table with a locally decodable code,</w:t>
+        <w:t xml:space="preserve">Encode the truth table with a</w:t>
+      </w:r>
+      <w:r>
+        <w:t xml:space="preserve"> </w:t>
+      </w:r>
+      <w:hyperlink w:anchor="def-locally-decodable">
+        <w:r>
+          <w:rPr>
+            <w:rStyle w:val="Hyperlink"/>
+          </w:rPr>
+          <w:t xml:space="preserve">locally decodable code</w:t>
+        </w:r>
+      </w:hyperlink>
+      <w:r>
+        <w:t xml:space="preserve"> </w:t>
+      </w:r>
+      <w:r>
+        <w:t xml:space="preserve">whose decoder is itself a small circuit,</w:t>
       </w:r>
       <w:r>
         <w:t xml:space="preserve"> </w:t>
@@ -9400,16 +9577,9 @@
         <w:t xml:space="preserve"> </w:t>
       </w:r>
       <m:oMath>
-        <m:acc>
-          <m:accPr>
-            <m:chr m:val="̂"/>
-          </m:accPr>
-          <m:e>
-            <m:r>
-              <m:t>f</m:t>
-            </m:r>
-          </m:e>
-        </m:acc>
+        <m:r>
+          <m:t>g</m:t>
+        </m:r>
       </m:oMath>
       <w:r>
         <w:t xml:space="preserve">.</w:t>
@@ -9424,16 +9594,9 @@
         <w:t xml:space="preserve"> </w:t>
       </w:r>
       <m:oMath>
-        <m:acc>
-          <m:accPr>
-            <m:chr m:val="̂"/>
-          </m:accPr>
-          <m:e>
-            <m:r>
-              <m:t>f</m:t>
-            </m:r>
-          </m:e>
-        </m:acc>
+        <m:r>
+          <m:t>g</m:t>
+        </m:r>
       </m:oMath>
       <w:r>
         <w:t xml:space="preserve"> </w:t>
@@ -9503,16 +9666,9 @@
         <w:t xml:space="preserve"> </w:t>
       </w:r>
       <m:oMath>
-        <m:acc>
-          <m:accPr>
-            <m:chr m:val="̂"/>
-          </m:accPr>
-          <m:e>
-            <m:r>
-              <m:t>f</m:t>
-            </m:r>
-          </m:e>
-        </m:acc>
+        <m:r>
+          <m:t>g</m:t>
+        </m:r>
       </m:oMath>
       <w:r>
         <w:t xml:space="preserve"> </w:t>
@@ -9545,8 +9701,8 @@
         <w:t xml:space="preserve">and their chapter 20 uses it to build pseudorandom generators.</w:t>
       </w:r>
     </w:p>
-    <w:bookmarkEnd w:id="33"/>
-    <w:bookmarkStart w:id="34" w:name="rem-codes-pcp"/>
+    <w:bookmarkEnd w:id="35"/>
+    <w:bookmarkStart w:id="36" w:name="rem-codes-pcp"/>
     <w:p>
       <w:pPr>
         <w:pStyle w:val="BodyText"/>
@@ -9590,52 +9746,88 @@
           <m:t>O</m:t>
         </m:r>
         <m:r>
-          <m:rPr>
-            <m:sty m:val="p"/>
-          </m:rPr>
-          <m:t>(</m:t>
-        </m:r>
-        <m:r>
-          <m:rPr>
-            <m:sty m:val="p"/>
-          </m:rPr>
-          <m:t>log</m:t>
-        </m:r>
+          <m:t>​</m:t>
+        </m:r>
+        <m:d>
+          <m:dPr>
+            <m:begChr m:val="("/>
+            <m:sepChr m:val=""/>
+            <m:endChr m:val=")"/>
+            <m:grow/>
+          </m:dPr>
+          <m:e>
+            <m:r>
+              <m:rPr>
+                <m:sty m:val="p"/>
+              </m:rPr>
+              <m:t>log</m:t>
+            </m:r>
+            <m:r>
+              <m:t>n</m:t>
+            </m:r>
+          </m:e>
+        </m:d>
+        <m:r>
+          <m:t>​</m:t>
+        </m:r>
+      </m:oMath>
+      <w:r>
+        <w:t xml:space="preserve"> </w:t>
+      </w:r>
+      <w:r>
+        <w:t xml:space="preserve">random bits,</w:t>
+      </w:r>
+      <w:r>
+        <w:t xml:space="preserve"> </w:t>
+      </w:r>
+      <w:r>
+        <w:t xml:space="preserve">where</w:t>
+      </w:r>
+      <w:r>
+        <w:t xml:space="preserve"> </w:t>
+      </w:r>
+      <m:oMath>
         <m:r>
           <m:t>n</m:t>
         </m:r>
-        <m:r>
-          <m:rPr>
-            <m:sty m:val="p"/>
-          </m:rPr>
-          <m:t>)</m:t>
-        </m:r>
-      </m:oMath>
-      <w:r>
-        <w:t xml:space="preserve"> </w:t>
-      </w:r>
-      <w:r>
-        <w:t xml:space="preserve">random bits,</w:t>
-      </w:r>
-      <w:r>
-        <w:t xml:space="preserve"> </w:t>
-      </w:r>
-      <w:r>
-        <w:t xml:space="preserve">where</w:t>
-      </w:r>
-      <w:r>
-        <w:t xml:space="preserve"> </w:t>
-      </w:r>
-      <m:oMath>
-        <m:r>
-          <m:t>n</m:t>
-        </m:r>
       </m:oMath>
       <w:r>
         <w:t xml:space="preserve"> </w:t>
       </w:r>
       <w:r>
         <w:t xml:space="preserve">is the length of the statement.</w:t>
+      </w:r>
+      <w:r>
+        <w:t xml:space="preserve"> </w:t>
+      </w:r>
+      <w:r>
+        <w:t xml:space="preserve">If the statement is true, some proof makes the verifier accept with probability 1;</w:t>
+      </w:r>
+      <w:r>
+        <w:t xml:space="preserve"> </w:t>
+      </w:r>
+      <w:r>
+        <w:t xml:space="preserve">if it is false, every proof makes the verifier reject with probability at least</w:t>
+      </w:r>
+      <w:r>
+        <w:t xml:space="preserve"> </w:t>
+      </w:r>
+      <m:oMath>
+        <m:r>
+          <m:t>1</m:t>
+        </m:r>
+        <m:r>
+          <m:rPr>
+            <m:sty m:val="p"/>
+          </m:rPr>
+          <m:t>/</m:t>
+        </m:r>
+        <m:r>
+          <m:t>2</m:t>
+        </m:r>
+      </m:oMath>
+      <w:r>
+        <w:t xml:space="preserve">.</w:t>
       </w:r>
       <w:r>
         <w:t xml:space="preserve"> </w:t>
@@ -9714,9 +9906,9 @@
         <w:t xml:space="preserve">They prove the full theorem in chapter 22.</w:t>
       </w:r>
     </w:p>
-    <w:bookmarkEnd w:id="34"/>
-    <w:bookmarkEnd w:id="35"/>
-    <w:bookmarkStart w:id="44" w:name="references"/>
+    <w:bookmarkEnd w:id="36"/>
+    <w:bookmarkEnd w:id="37"/>
+    <w:bookmarkStart w:id="46" w:name="references"/>
     <w:p>
       <w:pPr>
         <w:pStyle w:val="Heading2"/>
@@ -9725,8 +9917,8 @@
         <w:t xml:space="preserve">References</w:t>
       </w:r>
     </w:p>
-    <w:bookmarkStart w:id="43" w:name="refs"/>
-    <w:bookmarkStart w:id="37" w:name="ref-arora2009computational"/>
+    <w:bookmarkStart w:id="45" w:name="refs"/>
+    <w:bookmarkStart w:id="39" w:name="ref-arora2009computational"/>
     <w:p>
       <w:pPr>
         <w:pStyle w:val="Bibliography"/>
@@ -9750,7 +9942,7 @@
       <w:r>
         <w:t xml:space="preserve"> </w:t>
       </w:r>
-      <w:hyperlink r:id="rId36">
+      <w:hyperlink r:id="rId38">
         <w:r>
           <w:rPr>
             <w:rStyle w:val="Hyperlink"/>
@@ -9762,8 +9954,8 @@
         <w:t xml:space="preserve">.</w:t>
       </w:r>
     </w:p>
-    <w:bookmarkEnd w:id="37"/>
-    <w:bookmarkStart w:id="38" w:name="ref-mackay2003information"/>
+    <w:bookmarkEnd w:id="39"/>
+    <w:bookmarkStart w:id="40" w:name="ref-mackay2003information"/>
     <w:p>
       <w:pPr>
         <w:pStyle w:val="Bibliography"/>
@@ -9785,8 +9977,8 @@
         <w:t xml:space="preserve">. Cambridge University Press.</w:t>
       </w:r>
     </w:p>
-    <w:bookmarkEnd w:id="38"/>
-    <w:bookmarkStart w:id="40" w:name="ref-reed1960polynomial"/>
+    <w:bookmarkEnd w:id="40"/>
+    <w:bookmarkStart w:id="42" w:name="ref-reed1960polynomial"/>
     <w:p>
       <w:pPr>
         <w:pStyle w:val="Bibliography"/>
@@ -9819,7 +10011,7 @@
       <w:r>
         <w:t xml:space="preserve"> </w:t>
       </w:r>
-      <w:hyperlink r:id="rId39">
+      <w:hyperlink r:id="rId41">
         <w:r>
           <w:rPr>
             <w:rStyle w:val="Hyperlink"/>
@@ -9831,8 +10023,8 @@
         <w:t xml:space="preserve">.</w:t>
       </w:r>
     </w:p>
-    <w:bookmarkEnd w:id="40"/>
-    <w:bookmarkStart w:id="42" w:name="ref-shannon1948mathematical"/>
+    <w:bookmarkEnd w:id="42"/>
+    <w:bookmarkStart w:id="44" w:name="ref-shannon1948mathematical"/>
     <w:p>
       <w:pPr>
         <w:pStyle w:val="Bibliography"/>
@@ -9865,7 +10057,7 @@
       <w:r>
         <w:t xml:space="preserve"> </w:t>
       </w:r>
-      <w:hyperlink r:id="rId41">
+      <w:hyperlink r:id="rId43">
         <w:r>
           <w:rPr>
             <w:rStyle w:val="Hyperlink"/>
@@ -9877,9 +10069,9 @@
         <w:t xml:space="preserve">.</w:t>
       </w:r>
     </w:p>
-    <w:bookmarkEnd w:id="42"/>
-    <w:bookmarkEnd w:id="43"/>
     <w:bookmarkEnd w:id="44"/>
+    <w:bookmarkEnd w:id="45"/>
+    <w:bookmarkEnd w:id="46"/>
     <w:sectPr>
       <w:footnotePr>
         <w:numRestart w:val="eachSect"/>

</xml_diff>

<commit_message>
Deploying to gh-pages from @ Morrison-Lab/ids@4195480708d127c12b2289dfb64be4414f3308fd 🚀
</commit_message>
<xml_diff>
--- a/error-correcting-codes.docx
+++ b/error-correcting-codes.docx
@@ -15,7 +15,7 @@
         <w:pStyle w:val="Date"/>
       </w:pPr>
       <w:r>
-        <w:t xml:space="preserve">Last modified: 2026-10-14 23:34:53 (PDT)</w:t>
+        <w:t xml:space="preserve">Last modified: 2026-10-15 14:43:46 (PDT)</w:t>
       </w:r>
     </w:p>
     <w:p>
@@ -6892,13 +6892,26 @@
         <w:t xml:space="preserve"> </w:t>
       </w:r>
       <w:r>
-        <w:t xml:space="preserve">Arora and Barak (2009, chap. 11)</w:t>
-      </w:r>
-      <w:r>
-        <w:t xml:space="preserve"> </w:t>
-      </w:r>
-      <w:r>
-        <w:t xml:space="preserve">call it the Walsh–Hadamard code.</w:t>
+        <w:t xml:space="preserve">Also called the</w:t>
+      </w:r>
+      <w:r>
+        <w:t xml:space="preserve"> </w:t>
+      </w:r>
+      <w:r>
+        <w:rPr>
+          <w:b/>
+          <w:bCs/>
+        </w:rPr>
+        <w:t xml:space="preserve">Walsh–Hadamard code</w:t>
+      </w:r>
+      <w:r>
+        <w:t xml:space="preserve"> </w:t>
+      </w:r>
+      <w:r>
+        <w:t xml:space="preserve">(Arora and Barak 2009, chap. 11)</w:t>
+      </w:r>
+      <w:r>
+        <w:t xml:space="preserve">.</w:t>
       </w:r>
     </w:p>
     <w:bookmarkEnd w:id="29"/>

</xml_diff>

<commit_message>
Deploying to gh-pages from @ Morrison-Lab/ids@4138462fe088b9c0e032194cc486f52027cee046 🚀
</commit_message>
<xml_diff>
--- a/error-correcting-codes.docx
+++ b/error-correcting-codes.docx
@@ -15,7 +15,7 @@
         <w:pStyle w:val="Date"/>
       </w:pPr>
       <w:r>
-        <w:t xml:space="preserve">Last modified: 2026-10-19 11:40:46 (PDT)</w:t>
+        <w:t xml:space="preserve">Last modified: 2026-10-23 23:06:06 (PDT)</w:t>
       </w:r>
     </w:p>
     <w:p>
@@ -2757,42 +2757,42 @@
         <w:t xml:space="preserve"> </w:t>
       </w:r>
       <m:oMath>
-        <m:r>
-          <m:t>​</m:t>
-        </m:r>
-        <m:d>
-          <m:dPr>
-            <m:begChr m:val="["/>
-            <m:sepChr m:val=""/>
-            <m:endChr m:val="]"/>
-            <m:grow/>
-          </m:dPr>
-          <m:e>
-            <m:r>
-              <m:t>n</m:t>
-            </m:r>
-            <m:r>
-              <m:rPr>
-                <m:sty m:val="p"/>
-              </m:rPr>
-              <m:t>,</m:t>
-            </m:r>
-            <m:r>
-              <m:t>k</m:t>
-            </m:r>
-            <m:r>
-              <m:rPr>
-                <m:sty m:val="p"/>
-              </m:rPr>
-              <m:t>,</m:t>
-            </m:r>
-            <m:r>
-              <m:t>d</m:t>
-            </m:r>
-          </m:e>
-        </m:d>
         <m:sSub>
           <m:e>
+            <m:r>
+              <m:t>​</m:t>
+            </m:r>
+            <m:d>
+              <m:dPr>
+                <m:begChr m:val="["/>
+                <m:sepChr m:val=""/>
+                <m:endChr m:val="]"/>
+                <m:grow/>
+              </m:dPr>
+              <m:e>
+                <m:r>
+                  <m:t>n</m:t>
+                </m:r>
+                <m:r>
+                  <m:rPr>
+                    <m:sty m:val="p"/>
+                  </m:rPr>
+                  <m:t>,</m:t>
+                </m:r>
+                <m:r>
+                  <m:t>k</m:t>
+                </m:r>
+                <m:r>
+                  <m:rPr>
+                    <m:sty m:val="p"/>
+                  </m:rPr>
+                  <m:t>,</m:t>
+                </m:r>
+                <m:r>
+                  <m:t>d</m:t>
+                </m:r>
+              </m:e>
+            </m:d>
             <m:r>
               <m:t>​</m:t>
             </m:r>
@@ -3636,42 +3636,42 @@
         <w:t xml:space="preserve"> </w:t>
       </w:r>
       <m:oMath>
-        <m:r>
-          <m:t>​</m:t>
-        </m:r>
-        <m:d>
-          <m:dPr>
-            <m:begChr m:val="["/>
-            <m:sepChr m:val=""/>
-            <m:endChr m:val="]"/>
-            <m:grow/>
-          </m:dPr>
-          <m:e>
-            <m:r>
-              <m:t>7</m:t>
-            </m:r>
-            <m:r>
-              <m:rPr>
-                <m:sty m:val="p"/>
-              </m:rPr>
-              <m:t>,</m:t>
-            </m:r>
-            <m:r>
-              <m:t>4</m:t>
-            </m:r>
-            <m:r>
-              <m:rPr>
-                <m:sty m:val="p"/>
-              </m:rPr>
-              <m:t>,</m:t>
-            </m:r>
-            <m:r>
-              <m:t>3</m:t>
-            </m:r>
-          </m:e>
-        </m:d>
         <m:sSub>
           <m:e>
+            <m:r>
+              <m:t>​</m:t>
+            </m:r>
+            <m:d>
+              <m:dPr>
+                <m:begChr m:val="["/>
+                <m:sepChr m:val=""/>
+                <m:endChr m:val="]"/>
+                <m:grow/>
+              </m:dPr>
+              <m:e>
+                <m:r>
+                  <m:t>7</m:t>
+                </m:r>
+                <m:r>
+                  <m:rPr>
+                    <m:sty m:val="p"/>
+                  </m:rPr>
+                  <m:t>,</m:t>
+                </m:r>
+                <m:r>
+                  <m:t>4</m:t>
+                </m:r>
+                <m:r>
+                  <m:rPr>
+                    <m:sty m:val="p"/>
+                  </m:rPr>
+                  <m:t>,</m:t>
+                </m:r>
+                <m:r>
+                  <m:t>3</m:t>
+                </m:r>
+              </m:e>
+            </m:d>
             <m:r>
               <m:t>​</m:t>
             </m:r>
@@ -5281,60 +5281,60 @@
         <w:t xml:space="preserve"> </w:t>
       </w:r>
       <m:oMath>
-        <m:r>
-          <m:t>​</m:t>
-        </m:r>
-        <m:d>
-          <m:dPr>
-            <m:begChr m:val="["/>
-            <m:sepChr m:val=""/>
-            <m:endChr m:val="]"/>
-            <m:grow/>
-          </m:dPr>
-          <m:e>
-            <m:r>
-              <m:t>n</m:t>
-            </m:r>
-            <m:r>
-              <m:rPr>
-                <m:sty m:val="p"/>
-              </m:rPr>
-              <m:t>,</m:t>
-            </m:r>
-            <m:r>
-              <m:t>k</m:t>
-            </m:r>
-            <m:r>
-              <m:rPr>
-                <m:sty m:val="p"/>
-              </m:rPr>
-              <m:t>,</m:t>
-            </m:r>
-            <m:r>
-              <m:t>n</m:t>
-            </m:r>
-            <m:r>
-              <m:rPr>
-                <m:sty m:val="p"/>
-              </m:rPr>
-              <m:t>−</m:t>
-            </m:r>
-            <m:r>
-              <m:t>k</m:t>
-            </m:r>
-            <m:r>
-              <m:rPr>
-                <m:sty m:val="p"/>
-              </m:rPr>
-              <m:t>+</m:t>
-            </m:r>
-            <m:r>
-              <m:t>1</m:t>
-            </m:r>
-          </m:e>
-        </m:d>
         <m:sSub>
           <m:e>
+            <m:r>
+              <m:t>​</m:t>
+            </m:r>
+            <m:d>
+              <m:dPr>
+                <m:begChr m:val="["/>
+                <m:sepChr m:val=""/>
+                <m:endChr m:val="]"/>
+                <m:grow/>
+              </m:dPr>
+              <m:e>
+                <m:r>
+                  <m:t>n</m:t>
+                </m:r>
+                <m:r>
+                  <m:rPr>
+                    <m:sty m:val="p"/>
+                  </m:rPr>
+                  <m:t>,</m:t>
+                </m:r>
+                <m:r>
+                  <m:t>k</m:t>
+                </m:r>
+                <m:r>
+                  <m:rPr>
+                    <m:sty m:val="p"/>
+                  </m:rPr>
+                  <m:t>,</m:t>
+                </m:r>
+                <m:r>
+                  <m:t>n</m:t>
+                </m:r>
+                <m:r>
+                  <m:rPr>
+                    <m:sty m:val="p"/>
+                  </m:rPr>
+                  <m:t>−</m:t>
+                </m:r>
+                <m:r>
+                  <m:t>k</m:t>
+                </m:r>
+                <m:r>
+                  <m:rPr>
+                    <m:sty m:val="p"/>
+                  </m:rPr>
+                  <m:t>+</m:t>
+                </m:r>
+                <m:r>
+                  <m:t>1</m:t>
+                </m:r>
+              </m:e>
+            </m:d>
             <m:r>
               <m:t>​</m:t>
             </m:r>

</xml_diff>